<commit_message>
Arreglar la maquetación: tablas, guionación y el anexo que faltaba
Revisión página por página del PDF, que hasta ahora no había hecho:

- La tabla de la encuesta de madurez estaba rota. Pandoc repartía las cinco
  columnas casi iguales, así que "Resp." y "Pts" ocupaban un ancho enorme para
  un carácter, las preguntas bajaban de a una palabra y la tabla se estiraba
  cuatro páginas cortando filas al medio. Los anchos ahora salen del largo de
  los guiones en la línea separadora; ocupa dos páginas y se lee.
- Las filas ya no se parten entre páginas y el encabezado de tabla se repite.
- Saqué la guionación automática, que partía palabras ("bromatológi-ca").
  El informe modelo no guiona.
- Faltaba el Anexo II entero, con la tabla de herramientas y el diagrama del
  encadenamiento: se había perdido al reescribir la cabecera del generador.

Co-Authored-By: Claude Opus 5 (1M context) <noreply@anthropic.com>
</commit_message>
<xml_diff>
--- a/Material Campus/Proyecto Final/Proyecto/Entrega/TP Final Parte 1 - Dulxelitos.docx
+++ b/Material Campus/Proyecto Final/Proyecto/Entrega/TP Final Parte 1 - Dulxelitos.docx
@@ -6359,11 +6359,11 @@
         <w:tblLook w:firstRow="1" w:lastRow="0" w:firstColumn="0" w:lastColumn="0" w:noHBand="0" w:noVBand="0" w:val="0020"/>
       </w:tblPr>
       <w:tblGrid>
-        <w:gridCol w:w="1250"/>
-        <w:gridCol w:w="1250"/>
-        <w:gridCol w:w="2084"/>
-        <w:gridCol w:w="2084"/>
-        <w:gridCol w:w="1250"/>
+        <w:gridCol w:w="1274"/>
+        <w:gridCol w:w="3004"/>
+        <w:gridCol w:w="637"/>
+        <w:gridCol w:w="546"/>
+        <w:gridCol w:w="2457"/>
       </w:tblGrid>
       <w:tr>
         <w:trPr>
@@ -8033,14 +8033,15 @@
     <w:tbl>
       <w:tblPr>
         <w:tblStyle w:val="Table"/>
-        <w:tblW w:type="auto" w:w="0"/>
+        <w:tblW w:type="pct" w:w="5000"/>
+        <w:tblLayout w:type="fixed"/>
         <w:tblLook w:firstRow="1" w:lastRow="0" w:firstColumn="0" w:lastColumn="0" w:noHBand="0" w:noVBand="0" w:val="0020"/>
       </w:tblPr>
       <w:tblGrid>
-        <w:gridCol w:w="1980"/>
-        <w:gridCol w:w="1980"/>
-        <w:gridCol w:w="1980"/>
-        <w:gridCol w:w="1980"/>
+        <w:gridCol w:w="3727"/>
+        <w:gridCol w:w="1164"/>
+        <w:gridCol w:w="1164"/>
+        <w:gridCol w:w="1863"/>
       </w:tblGrid>
       <w:tr>
         <w:trPr>
@@ -9334,7 +9335,7 @@
       </w:r>
     </w:p>
     <w:bookmarkEnd w:id="65"/>
-    <w:bookmarkStart w:id="67" w:name="anexos"/>
+    <w:bookmarkStart w:id="68" w:name="anexos"/>
     <w:p>
       <w:pPr>
         <w:pStyle w:val="Heading1"/>
@@ -9635,8 +9636,1280 @@
         </w:tc>
       </w:tr>
     </w:tbl>
+    <w:p>
+      <w:r>
+        <w:br w:type="page"/>
+      </w:r>
+    </w:p>
     <w:bookmarkEnd w:id="66"/>
+    <w:bookmarkStart w:id="67" w:name="Xb847e54c146f6c28789d967e367bf46cf8beba9"/>
+    <w:p>
+      <w:pPr>
+        <w:pStyle w:val="Heading2"/>
+      </w:pPr>
+      <w:r>
+        <w:t xml:space="preserve">Anexo II: herramientas de análisis aplicadas</w:t>
+      </w:r>
+    </w:p>
+    <w:p>
+      <w:pPr>
+        <w:pStyle w:val="FirstParagraph"/>
+      </w:pPr>
+      <w:r>
+        <w:rPr>
+          <w:b/>
+          <w:bCs/>
+        </w:rPr>
+        <w:t xml:space="preserve">Cuadro general</w:t>
+      </w:r>
+    </w:p>
+    <w:tbl>
+      <w:tblPr>
+        <w:tblStyle w:val="Table"/>
+        <w:tblW w:type="pct" w:w="5000"/>
+        <w:tblLayout w:type="fixed"/>
+        <w:tblLook w:firstRow="1" w:lastRow="0" w:firstColumn="0" w:lastColumn="0" w:noHBand="0" w:noVBand="0" w:val="0020"/>
+      </w:tblPr>
+      <w:tblGrid>
+        <w:gridCol w:w="1218"/>
+        <w:gridCol w:w="1566"/>
+        <w:gridCol w:w="1392"/>
+        <w:gridCol w:w="2523"/>
+        <w:gridCol w:w="1218"/>
+      </w:tblGrid>
+      <w:tr>
+        <w:trPr>
+          <w:tblHeader w:val="on"/>
+        </w:trPr>
+        <w:tc>
+          <w:tcPr/>
+          <w:p>
+            <w:pPr>
+              <w:pStyle w:val="Compact"/>
+            </w:pPr>
+            <w:r>
+              <w:t xml:space="preserve">Sección</w:t>
+            </w:r>
+          </w:p>
+        </w:tc>
+        <w:tc>
+          <w:tcPr/>
+          <w:p>
+            <w:pPr>
+              <w:pStyle w:val="Compact"/>
+            </w:pPr>
+            <w:r>
+              <w:t xml:space="preserve">Herramienta</w:t>
+            </w:r>
+          </w:p>
+        </w:tc>
+        <w:tc>
+          <w:tcPr/>
+          <w:p>
+            <w:pPr>
+              <w:pStyle w:val="Compact"/>
+            </w:pPr>
+            <w:r>
+              <w:t xml:space="preserve">Autor / origen</w:t>
+            </w:r>
+          </w:p>
+        </w:tc>
+        <w:tc>
+          <w:tcPr/>
+          <w:p>
+            <w:pPr>
+              <w:pStyle w:val="Compact"/>
+            </w:pPr>
+            <w:r>
+              <w:t xml:space="preserve">Para qué la usamos</w:t>
+            </w:r>
+          </w:p>
+        </w:tc>
+        <w:tc>
+          <w:tcPr/>
+          <w:p>
+            <w:pPr>
+              <w:pStyle w:val="Compact"/>
+            </w:pPr>
+            <w:r>
+              <w:t xml:space="preserve">Dónde la vimos</w:t>
+            </w:r>
+          </w:p>
+        </w:tc>
+      </w:tr>
+      <w:tr>
+        <w:tc>
+          <w:tcPr/>
+          <w:p>
+            <w:pPr>
+              <w:pStyle w:val="Compact"/>
+            </w:pPr>
+            <w:r>
+              <w:t xml:space="preserve">1. La organización</w:t>
+            </w:r>
+          </w:p>
+        </w:tc>
+        <w:tc>
+          <w:tcPr/>
+          <w:p>
+            <w:pPr>
+              <w:pStyle w:val="Compact"/>
+            </w:pPr>
+            <w:r>
+              <w:t xml:space="preserve">No aplica</w:t>
+            </w:r>
+          </w:p>
+        </w:tc>
+        <w:tc>
+          <w:tcPr/>
+          <w:p>
+            <w:pPr>
+              <w:pStyle w:val="Compact"/>
+            </w:pPr>
+          </w:p>
+        </w:tc>
+        <w:tc>
+          <w:tcPr/>
+          <w:p>
+            <w:pPr>
+              <w:pStyle w:val="Compact"/>
+            </w:pPr>
+            <w:r>
+              <w:t xml:space="preserve">Es relevamiento descriptivo. Seguimos la estructura que pide el enunciado</w:t>
+            </w:r>
+          </w:p>
+        </w:tc>
+        <w:tc>
+          <w:tcPr/>
+          <w:p>
+            <w:pPr>
+              <w:pStyle w:val="Compact"/>
+            </w:pPr>
+            <w:r>
+              <w:t xml:space="preserve">Enunciado del TP</w:t>
+            </w:r>
+          </w:p>
+        </w:tc>
+      </w:tr>
+      <w:tr>
+        <w:tc>
+          <w:tcPr/>
+          <w:p>
+            <w:pPr>
+              <w:pStyle w:val="Compact"/>
+            </w:pPr>
+            <w:r>
+              <w:t xml:space="preserve">2. El contexto</w:t>
+            </w:r>
+          </w:p>
+        </w:tc>
+        <w:tc>
+          <w:tcPr/>
+          <w:p>
+            <w:pPr>
+              <w:pStyle w:val="Compact"/>
+            </w:pPr>
+            <w:r>
+              <w:t xml:space="preserve">PESTEL</w:t>
+            </w:r>
+          </w:p>
+        </w:tc>
+        <w:tc>
+          <w:tcPr/>
+          <w:p>
+            <w:pPr>
+              <w:pStyle w:val="Compact"/>
+            </w:pPr>
+            <w:r>
+              <w:t xml:space="preserve">Aguilar (1967)</w:t>
+            </w:r>
+          </w:p>
+        </w:tc>
+        <w:tc>
+          <w:tcPr/>
+          <w:p>
+            <w:pPr>
+              <w:pStyle w:val="Compact"/>
+            </w:pPr>
+            <w:r>
+              <w:t xml:space="preserve">Mirar el entorno general: político, económico, social, tecnológico, ecológico y legal</w:t>
+            </w:r>
+          </w:p>
+        </w:tc>
+        <w:tc>
+          <w:tcPr/>
+          <w:p>
+            <w:pPr>
+              <w:pStyle w:val="Compact"/>
+            </w:pPr>
+            <w:r>
+              <w:t xml:space="preserve">Clase 2</w:t>
+            </w:r>
+          </w:p>
+        </w:tc>
+      </w:tr>
+      <w:tr>
+        <w:tc>
+          <w:tcPr/>
+          <w:p>
+            <w:pPr>
+              <w:pStyle w:val="Compact"/>
+            </w:pPr>
+            <w:r>
+              <w:t xml:space="preserve">2. El contexto</w:t>
+            </w:r>
+          </w:p>
+        </w:tc>
+        <w:tc>
+          <w:tcPr/>
+          <w:p>
+            <w:pPr>
+              <w:pStyle w:val="Compact"/>
+            </w:pPr>
+            <w:r>
+              <w:t xml:space="preserve">Cinco fuerzas</w:t>
+            </w:r>
+          </w:p>
+        </w:tc>
+        <w:tc>
+          <w:tcPr/>
+          <w:p>
+            <w:pPr>
+              <w:pStyle w:val="Compact"/>
+            </w:pPr>
+            <w:r>
+              <w:t xml:space="preserve">Porter (1979, 1980)</w:t>
+            </w:r>
+          </w:p>
+        </w:tc>
+        <w:tc>
+          <w:tcPr/>
+          <w:p>
+            <w:pPr>
+              <w:pStyle w:val="Compact"/>
+            </w:pPr>
+            <w:r>
+              <w:t xml:space="preserve">Analizar el sector: rivalidad, proveedores, compradores, entrantes y sustitutos</w:t>
+            </w:r>
+          </w:p>
+        </w:tc>
+        <w:tc>
+          <w:tcPr/>
+          <w:p>
+            <w:pPr>
+              <w:pStyle w:val="Compact"/>
+            </w:pPr>
+            <w:r>
+              <w:t xml:space="preserve">Clase 2</w:t>
+            </w:r>
+          </w:p>
+        </w:tc>
+      </w:tr>
+      <w:tr>
+        <w:tc>
+          <w:tcPr/>
+          <w:p>
+            <w:pPr>
+              <w:pStyle w:val="Compact"/>
+            </w:pPr>
+            <w:r>
+              <w:t xml:space="preserve">2. El contexto</w:t>
+            </w:r>
+          </w:p>
+        </w:tc>
+        <w:tc>
+          <w:tcPr/>
+          <w:p>
+            <w:pPr>
+              <w:pStyle w:val="Compact"/>
+            </w:pPr>
+            <w:r>
+              <w:t xml:space="preserve">Cadena de valor</w:t>
+            </w:r>
+          </w:p>
+        </w:tc>
+        <w:tc>
+          <w:tcPr/>
+          <w:p>
+            <w:pPr>
+              <w:pStyle w:val="Compact"/>
+            </w:pPr>
+            <w:r>
+              <w:t xml:space="preserve">Porter (1985)</w:t>
+            </w:r>
+          </w:p>
+        </w:tc>
+        <w:tc>
+          <w:tcPr/>
+          <w:p>
+            <w:pPr>
+              <w:pStyle w:val="Compact"/>
+            </w:pPr>
+            <w:r>
+              <w:t xml:space="preserve">Ver dónde se crea y dónde se pierde margen puertas adentro</w:t>
+            </w:r>
+          </w:p>
+        </w:tc>
+        <w:tc>
+          <w:tcPr/>
+          <w:p>
+            <w:pPr>
+              <w:pStyle w:val="Compact"/>
+            </w:pPr>
+            <w:r>
+              <w:t xml:space="preserve">Clase 2 (aparece también en la Clase 1)</w:t>
+            </w:r>
+          </w:p>
+        </w:tc>
+      </w:tr>
+      <w:tr>
+        <w:tc>
+          <w:tcPr/>
+          <w:p>
+            <w:pPr>
+              <w:pStyle w:val="Compact"/>
+            </w:pPr>
+            <w:r>
+              <w:t xml:space="preserve">2. El contexto</w:t>
+            </w:r>
+          </w:p>
+        </w:tc>
+        <w:tc>
+          <w:tcPr/>
+          <w:p>
+            <w:pPr>
+              <w:pStyle w:val="Compact"/>
+            </w:pPr>
+            <w:r>
+              <w:t xml:space="preserve">FODA cruzado</w:t>
+            </w:r>
+          </w:p>
+        </w:tc>
+        <w:tc>
+          <w:tcPr/>
+          <w:p>
+            <w:pPr>
+              <w:pStyle w:val="Compact"/>
+            </w:pPr>
+            <w:r>
+              <w:t xml:space="preserve">Herramienta clásica de planeamiento</w:t>
+            </w:r>
+          </w:p>
+        </w:tc>
+        <w:tc>
+          <w:tcPr/>
+          <w:p>
+            <w:pPr>
+              <w:pStyle w:val="Compact"/>
+            </w:pPr>
+            <w:r>
+              <w:t xml:space="preserve">Combinar todo lo anterior y sacar iniciativas concretas</w:t>
+            </w:r>
+          </w:p>
+        </w:tc>
+        <w:tc>
+          <w:tcPr/>
+          <w:p>
+            <w:pPr>
+              <w:pStyle w:val="Compact"/>
+            </w:pPr>
+            <w:r>
+              <w:t xml:space="preserve">Clase 2</w:t>
+            </w:r>
+          </w:p>
+        </w:tc>
+      </w:tr>
+      <w:tr>
+        <w:tc>
+          <w:tcPr/>
+          <w:p>
+            <w:pPr>
+              <w:pStyle w:val="Compact"/>
+            </w:pPr>
+            <w:r>
+              <w:t xml:space="preserve">3. Modelo de negocio</w:t>
+            </w:r>
+          </w:p>
+        </w:tc>
+        <w:tc>
+          <w:tcPr/>
+          <w:p>
+            <w:pPr>
+              <w:pStyle w:val="Compact"/>
+            </w:pPr>
+            <w:r>
+              <w:t xml:space="preserve">Business Model Canvas</w:t>
+            </w:r>
+          </w:p>
+        </w:tc>
+        <w:tc>
+          <w:tcPr/>
+          <w:p>
+            <w:pPr>
+              <w:pStyle w:val="Compact"/>
+            </w:pPr>
+            <w:r>
+              <w:t xml:space="preserve">Osterwalder y Pigneur (2010)</w:t>
+            </w:r>
+          </w:p>
+        </w:tc>
+        <w:tc>
+          <w:tcPr/>
+          <w:p>
+            <w:pPr>
+              <w:pStyle w:val="Compact"/>
+            </w:pPr>
+            <w:r>
+              <w:t xml:space="preserve">Describir cómo la empresa crea, entrega y captura valor hoy</w:t>
+            </w:r>
+          </w:p>
+        </w:tc>
+        <w:tc>
+          <w:tcPr/>
+          <w:p>
+            <w:pPr>
+              <w:pStyle w:val="Compact"/>
+            </w:pPr>
+            <w:r>
+              <w:t xml:space="preserve">Clase 2</w:t>
+            </w:r>
+          </w:p>
+        </w:tc>
+      </w:tr>
+      <w:tr>
+        <w:tc>
+          <w:tcPr/>
+          <w:p>
+            <w:pPr>
+              <w:pStyle w:val="Compact"/>
+            </w:pPr>
+            <w:r>
+              <w:t xml:space="preserve">3. Modelo de negocio</w:t>
+            </w:r>
+          </w:p>
+        </w:tc>
+        <w:tc>
+          <w:tcPr/>
+          <w:p>
+            <w:pPr>
+              <w:pStyle w:val="Compact"/>
+            </w:pPr>
+            <w:r>
+              <w:t xml:space="preserve">Explotación y exploración (Run / Change the Business)</w:t>
+            </w:r>
+          </w:p>
+        </w:tc>
+        <w:tc>
+          <w:tcPr/>
+          <w:p>
+            <w:pPr>
+              <w:pStyle w:val="Compact"/>
+            </w:pPr>
+            <w:r>
+              <w:t xml:space="preserve">Enfoque bimodal de la materia</w:t>
+            </w:r>
+          </w:p>
+        </w:tc>
+        <w:tc>
+          <w:tcPr/>
+          <w:p>
+            <w:pPr>
+              <w:pStyle w:val="Compact"/>
+            </w:pPr>
+            <w:r>
+              <w:t xml:space="preserve">Separar lo que sostiene la operación de lo que la transforma</w:t>
+            </w:r>
+          </w:p>
+        </w:tc>
+        <w:tc>
+          <w:tcPr/>
+          <w:p>
+            <w:pPr>
+              <w:pStyle w:val="Compact"/>
+            </w:pPr>
+            <w:r>
+              <w:t xml:space="preserve">Presentación introductoria y Clase 3</w:t>
+            </w:r>
+          </w:p>
+        </w:tc>
+      </w:tr>
+      <w:tr>
+        <w:tc>
+          <w:tcPr/>
+          <w:p>
+            <w:pPr>
+              <w:pStyle w:val="Compact"/>
+            </w:pPr>
+            <w:r>
+              <w:t xml:space="preserve">3. Modelo de negocio</w:t>
+            </w:r>
+          </w:p>
+        </w:tc>
+        <w:tc>
+          <w:tcPr/>
+          <w:p>
+            <w:pPr>
+              <w:pStyle w:val="Compact"/>
+            </w:pPr>
+            <w:r>
+              <w:t xml:space="preserve">Liderazgo en costos vs. diferenciación</w:t>
+            </w:r>
+          </w:p>
+        </w:tc>
+        <w:tc>
+          <w:tcPr/>
+          <w:p>
+            <w:pPr>
+              <w:pStyle w:val="Compact"/>
+            </w:pPr>
+            <w:r>
+              <w:t xml:space="preserve">Porter (1980)</w:t>
+            </w:r>
+          </w:p>
+        </w:tc>
+        <w:tc>
+          <w:tcPr/>
+          <w:p>
+            <w:pPr>
+              <w:pStyle w:val="Compact"/>
+            </w:pPr>
+            <w:r>
+              <w:t xml:space="preserve">Definir cuál es la ventaja competitiva real de la empresa</w:t>
+            </w:r>
+          </w:p>
+        </w:tc>
+        <w:tc>
+          <w:tcPr/>
+          <w:p>
+            <w:pPr>
+              <w:pStyle w:val="Compact"/>
+            </w:pPr>
+            <w:r>
+              <w:t xml:space="preserve">Clase 2</w:t>
+            </w:r>
+          </w:p>
+        </w:tc>
+      </w:tr>
+      <w:tr>
+        <w:tc>
+          <w:tcPr/>
+          <w:p>
+            <w:pPr>
+              <w:pStyle w:val="Compact"/>
+            </w:pPr>
+            <w:r>
+              <w:t xml:space="preserve">4. Propuesta de valor</w:t>
+            </w:r>
+          </w:p>
+        </w:tc>
+        <w:tc>
+          <w:tcPr/>
+          <w:p>
+            <w:pPr>
+              <w:pStyle w:val="Compact"/>
+            </w:pPr>
+            <w:r>
+              <w:t xml:space="preserve">Value Proposition Canvas</w:t>
+            </w:r>
+          </w:p>
+        </w:tc>
+        <w:tc>
+          <w:tcPr/>
+          <w:p>
+            <w:pPr>
+              <w:pStyle w:val="Compact"/>
+            </w:pPr>
+            <w:r>
+              <w:t xml:space="preserve">Osterwalder, Pigneur, Bernarda y Smith (2014)</w:t>
+            </w:r>
+          </w:p>
+        </w:tc>
+        <w:tc>
+          <w:tcPr/>
+          <w:p>
+            <w:pPr>
+              <w:pStyle w:val="Compact"/>
+            </w:pPr>
+            <w:r>
+              <w:t xml:space="preserve">Cruzar lo que el cliente necesita con lo que la empresa ofrece, y medir el encaje</w:t>
+            </w:r>
+          </w:p>
+        </w:tc>
+        <w:tc>
+          <w:tcPr/>
+          <w:p>
+            <w:pPr>
+              <w:pStyle w:val="Compact"/>
+            </w:pPr>
+            <w:r>
+              <w:t xml:space="preserve">Clase 2</w:t>
+            </w:r>
+          </w:p>
+        </w:tc>
+      </w:tr>
+      <w:tr>
+        <w:tc>
+          <w:tcPr/>
+          <w:p>
+            <w:pPr>
+              <w:pStyle w:val="Compact"/>
+            </w:pPr>
+            <w:r>
+              <w:t xml:space="preserve">5. Madurez</w:t>
+            </w:r>
+          </w:p>
+        </w:tc>
+        <w:tc>
+          <w:tcPr/>
+          <w:p>
+            <w:pPr>
+              <w:pStyle w:val="Compact"/>
+            </w:pPr>
+            <w:r>
+              <w:t xml:space="preserve">Modelo de madurez digital de la cátedra</w:t>
+            </w:r>
+          </w:p>
+        </w:tc>
+        <w:tc>
+          <w:tcPr/>
+          <w:p>
+            <w:pPr>
+              <w:pStyle w:val="Compact"/>
+            </w:pPr>
+            <w:r>
+              <w:t xml:space="preserve">Cátedra de Gestión Gerencial</w:t>
+            </w:r>
+          </w:p>
+        </w:tc>
+        <w:tc>
+          <w:tcPr/>
+          <w:p>
+            <w:pPr>
+              <w:pStyle w:val="Compact"/>
+            </w:pPr>
+            <w:r>
+              <w:t xml:space="preserve">Evaluar seis dimensiones con escala A a E, más una séptima que agregamos</w:t>
+            </w:r>
+          </w:p>
+        </w:tc>
+        <w:tc>
+          <w:tcPr/>
+          <w:p>
+            <w:pPr>
+              <w:pStyle w:val="Compact"/>
+            </w:pPr>
+            <w:r>
+              <w:t xml:space="preserve">Material de cátedra</w:t>
+            </w:r>
+          </w:p>
+        </w:tc>
+      </w:tr>
+      <w:tr>
+        <w:tc>
+          <w:tcPr/>
+          <w:p>
+            <w:pPr>
+              <w:pStyle w:val="Compact"/>
+            </w:pPr>
+            <w:r>
+              <w:t xml:space="preserve">5. Madurez</w:t>
+            </w:r>
+          </w:p>
+        </w:tc>
+        <w:tc>
+          <w:tcPr/>
+          <w:p>
+            <w:pPr>
+              <w:pStyle w:val="Compact"/>
+            </w:pPr>
+            <w:r>
+              <w:t xml:space="preserve">Costo de No Actuar (CoI)</w:t>
+            </w:r>
+          </w:p>
+        </w:tc>
+        <w:tc>
+          <w:tcPr/>
+          <w:p>
+            <w:pPr>
+              <w:pStyle w:val="Compact"/>
+            </w:pPr>
+            <w:r>
+              <w:t xml:space="preserve">Fórmula de tres componentes</w:t>
+            </w:r>
+          </w:p>
+        </w:tc>
+        <w:tc>
+          <w:tcPr/>
+          <w:p>
+            <w:pPr>
+              <w:pStyle w:val="Compact"/>
+            </w:pPr>
+            <w:r>
+              <w:t xml:space="preserve">Poner en plata lo que cuesta no resolver cada brecha</w:t>
+            </w:r>
+          </w:p>
+        </w:tc>
+        <w:tc>
+          <w:tcPr/>
+          <w:p>
+            <w:pPr>
+              <w:pStyle w:val="Compact"/>
+            </w:pPr>
+            <w:r>
+              <w:t xml:space="preserve">Clase 3</w:t>
+            </w:r>
+          </w:p>
+        </w:tc>
+      </w:tr>
+    </w:tbl>
+    <w:p>
+      <w:pPr>
+        <w:pStyle w:val="BodyText"/>
+      </w:pPr>
+      <w:r>
+        <w:rPr>
+          <w:b/>
+          <w:bCs/>
+        </w:rPr>
+        <w:t xml:space="preserve">Cómo se encadenan</w:t>
+      </w:r>
+    </w:p>
+    <w:p>
+      <w:pPr>
+        <w:pStyle w:val="BodyText"/>
+      </w:pPr>
+      <w:r>
+        <w:t xml:space="preserve">El orden en que las aplicamos no es casual. Cada herramienta produce algo que la siguiente necesita.</w:t>
+      </w:r>
+    </w:p>
+    <w:p>
+      <w:pPr>
+        <w:pStyle w:val="SourceCode"/>
+      </w:pPr>
+      <w:r>
+        <w:rPr>
+          <w:rStyle w:val="VerbatimChar"/>
+        </w:rPr>
+        <w:t xml:space="preserve">SECCIÓN 1</w:t>
+      </w:r>
+      <w:r>
+        <w:br/>
+      </w:r>
+      <w:r>
+        <w:rPr>
+          <w:rStyle w:val="VerbatimChar"/>
+        </w:rPr>
+        <w:t xml:space="preserve">  Relevamiento de la organización</w:t>
+      </w:r>
+      <w:r>
+        <w:br/>
+      </w:r>
+      <w:r>
+        <w:rPr>
+          <w:rStyle w:val="VerbatimChar"/>
+        </w:rPr>
+        <w:t xml:space="preserve">       |</w:t>
+      </w:r>
+      <w:r>
+        <w:br/>
+      </w:r>
+      <w:r>
+        <w:rPr>
+          <w:rStyle w:val="VerbatimChar"/>
+        </w:rPr>
+        <w:t xml:space="preserve">       v</w:t>
+      </w:r>
+      <w:r>
+        <w:br/>
+      </w:r>
+      <w:r>
+        <w:rPr>
+          <w:rStyle w:val="VerbatimChar"/>
+        </w:rPr>
+        <w:t xml:space="preserve">SECCIÓN 2</w:t>
+      </w:r>
+      <w:r>
+        <w:br/>
+      </w:r>
+      <w:r>
+        <w:rPr>
+          <w:rStyle w:val="VerbatimChar"/>
+        </w:rPr>
+        <w:t xml:space="preserve">  PESTEL ---------------+</w:t>
+      </w:r>
+      <w:r>
+        <w:br/>
+      </w:r>
+      <w:r>
+        <w:rPr>
+          <w:rStyle w:val="VerbatimChar"/>
+        </w:rPr>
+        <w:t xml:space="preserve">                        |--&gt; Oportunidades y Amenazas --+</w:t>
+      </w:r>
+      <w:r>
+        <w:br/>
+      </w:r>
+      <w:r>
+        <w:rPr>
+          <w:rStyle w:val="VerbatimChar"/>
+        </w:rPr>
+        <w:t xml:space="preserve">  Cinco fuerzas --------+                               |</w:t>
+      </w:r>
+      <w:r>
+        <w:br/>
+      </w:r>
+      <w:r>
+        <w:rPr>
+          <w:rStyle w:val="VerbatimChar"/>
+        </w:rPr>
+        <w:t xml:space="preserve">                                                        +--&gt; FODA CRUZADO</w:t>
+      </w:r>
+      <w:r>
+        <w:br/>
+      </w:r>
+      <w:r>
+        <w:rPr>
+          <w:rStyle w:val="VerbatimChar"/>
+        </w:rPr>
+        <w:t xml:space="preserve">  Cadena de valor ----&gt; Fortalezas y Debilidades -------+     (iniciativas)</w:t>
+      </w:r>
+      <w:r>
+        <w:br/>
+      </w:r>
+      <w:r>
+        <w:rPr>
+          <w:rStyle w:val="VerbatimChar"/>
+        </w:rPr>
+        <w:t xml:space="preserve">       |</w:t>
+      </w:r>
+      <w:r>
+        <w:br/>
+      </w:r>
+      <w:r>
+        <w:rPr>
+          <w:rStyle w:val="VerbatimChar"/>
+        </w:rPr>
+        <w:t xml:space="preserve">       v</w:t>
+      </w:r>
+      <w:r>
+        <w:br/>
+      </w:r>
+      <w:r>
+        <w:rPr>
+          <w:rStyle w:val="VerbatimChar"/>
+        </w:rPr>
+        <w:t xml:space="preserve">SECCIÓN 3                          SECCIÓN 4                    SECCIÓN 5</w:t>
+      </w:r>
+      <w:r>
+        <w:br/>
+      </w:r>
+      <w:r>
+        <w:rPr>
+          <w:rStyle w:val="VerbatimChar"/>
+        </w:rPr>
+        <w:t xml:space="preserve">  Business Model Canvas              Value Proposition Canvas      Modelo de madurez</w:t>
+      </w:r>
+      <w:r>
+        <w:br/>
+      </w:r>
+      <w:r>
+        <w:rPr>
+          <w:rStyle w:val="VerbatimChar"/>
+        </w:rPr>
+        <w:t xml:space="preserve">  + Run / Change the Business        (segmento prioritario)        + Costo de No Actuar</w:t>
+      </w:r>
+      <w:r>
+        <w:br/>
+      </w:r>
+      <w:r>
+        <w:rPr>
+          <w:rStyle w:val="VerbatimChar"/>
+        </w:rPr>
+        <w:t xml:space="preserve">       |                                   |                             |</w:t>
+      </w:r>
+      <w:r>
+        <w:br/>
+      </w:r>
+      <w:r>
+        <w:rPr>
+          <w:rStyle w:val="VerbatimChar"/>
+        </w:rPr>
+        <w:t xml:space="preserve">       +-----------------------------------+-----------------------------+</w:t>
+      </w:r>
+      <w:r>
+        <w:br/>
+      </w:r>
+      <w:r>
+        <w:rPr>
+          <w:rStyle w:val="VerbatimChar"/>
+        </w:rPr>
+        <w:t xml:space="preserve">                                           |</w:t>
+      </w:r>
+      <w:r>
+        <w:br/>
+      </w:r>
+      <w:r>
+        <w:rPr>
+          <w:rStyle w:val="VerbatimChar"/>
+        </w:rPr>
+        <w:t xml:space="preserve">                                           v</w:t>
+      </w:r>
+      <w:r>
+        <w:br/>
+      </w:r>
+      <w:r>
+        <w:rPr>
+          <w:rStyle w:val="VerbatimChar"/>
+        </w:rPr>
+        <w:t xml:space="preserve">                                    SECCIÓN 6 (se entrega aparte)</w:t>
+      </w:r>
+      <w:r>
+        <w:br/>
+      </w:r>
+      <w:r>
+        <w:rPr>
+          <w:rStyle w:val="VerbatimChar"/>
+        </w:rPr>
+        <w:t xml:space="preserve">                                    Problema gerencial priorizado</w:t>
+      </w:r>
+    </w:p>
+    <w:p>
+      <w:pPr>
+        <w:pStyle w:val="FirstParagraph"/>
+      </w:pPr>
+      <w:r>
+        <w:t xml:space="preserve">En concreto:</w:t>
+      </w:r>
+    </w:p>
+    <w:p>
+      <w:pPr>
+        <w:pStyle w:val="Compact"/>
+        <w:numPr>
+          <w:ilvl w:val="0"/>
+          <w:numId w:val="1019"/>
+        </w:numPr>
+      </w:pPr>
+      <w:r>
+        <w:t xml:space="preserve">El</w:t>
+      </w:r>
+      <w:r>
+        <w:t xml:space="preserve"> </w:t>
+      </w:r>
+      <w:r>
+        <w:rPr>
+          <w:b/>
+          <w:bCs/>
+        </w:rPr>
+        <w:t xml:space="preserve">PESTEL</w:t>
+      </w:r>
+      <w:r>
+        <w:t xml:space="preserve"> </w:t>
+      </w:r>
+      <w:r>
+        <w:t xml:space="preserve">y las</w:t>
+      </w:r>
+      <w:r>
+        <w:t xml:space="preserve"> </w:t>
+      </w:r>
+      <w:r>
+        <w:rPr>
+          <w:b/>
+          <w:bCs/>
+        </w:rPr>
+        <w:t xml:space="preserve">cinco fuerzas</w:t>
+      </w:r>
+      <w:r>
+        <w:t xml:space="preserve"> </w:t>
+      </w:r>
+      <w:r>
+        <w:t xml:space="preserve">producen las oportunidades y las amenazas del FODA.</w:t>
+      </w:r>
+    </w:p>
+    <w:p>
+      <w:pPr>
+        <w:pStyle w:val="Compact"/>
+        <w:numPr>
+          <w:ilvl w:val="0"/>
+          <w:numId w:val="1019"/>
+        </w:numPr>
+      </w:pPr>
+      <w:r>
+        <w:t xml:space="preserve">La</w:t>
+      </w:r>
+      <w:r>
+        <w:t xml:space="preserve"> </w:t>
+      </w:r>
+      <w:r>
+        <w:rPr>
+          <w:b/>
+          <w:bCs/>
+        </w:rPr>
+        <w:t xml:space="preserve">cadena de valor</w:t>
+      </w:r>
+      <w:r>
+        <w:t xml:space="preserve"> </w:t>
+      </w:r>
+      <w:r>
+        <w:t xml:space="preserve">produce las fortalezas y las debilidades.</w:t>
+      </w:r>
+    </w:p>
+    <w:p>
+      <w:pPr>
+        <w:pStyle w:val="Compact"/>
+        <w:numPr>
+          <w:ilvl w:val="0"/>
+          <w:numId w:val="1019"/>
+        </w:numPr>
+      </w:pPr>
+      <w:r>
+        <w:t xml:space="preserve">El</w:t>
+      </w:r>
+      <w:r>
+        <w:t xml:space="preserve"> </w:t>
+      </w:r>
+      <w:r>
+        <w:rPr>
+          <w:b/>
+          <w:bCs/>
+        </w:rPr>
+        <w:t xml:space="preserve">FODA cruzado</w:t>
+      </w:r>
+      <w:r>
+        <w:t xml:space="preserve"> </w:t>
+      </w:r>
+      <w:r>
+        <w:t xml:space="preserve">combina las cuatro y de ahí salen las iniciativas.</w:t>
+      </w:r>
+    </w:p>
+    <w:p>
+      <w:pPr>
+        <w:pStyle w:val="Compact"/>
+        <w:numPr>
+          <w:ilvl w:val="0"/>
+          <w:numId w:val="1019"/>
+        </w:numPr>
+      </w:pPr>
+      <w:r>
+        <w:t xml:space="preserve">El</w:t>
+      </w:r>
+      <w:r>
+        <w:t xml:space="preserve"> </w:t>
+      </w:r>
+      <w:r>
+        <w:rPr>
+          <w:b/>
+          <w:bCs/>
+        </w:rPr>
+        <w:t xml:space="preserve">segmento prioritario</w:t>
+      </w:r>
+      <w:r>
+        <w:t xml:space="preserve"> </w:t>
+      </w:r>
+      <w:r>
+        <w:t xml:space="preserve">de la sección 4 se justifica con lo que vimos en las cinco fuerzas.</w:t>
+      </w:r>
+    </w:p>
+    <w:p>
+      <w:pPr>
+        <w:pStyle w:val="Compact"/>
+        <w:numPr>
+          <w:ilvl w:val="0"/>
+          <w:numId w:val="1019"/>
+        </w:numPr>
+      </w:pPr>
+      <w:r>
+        <w:t xml:space="preserve">La</w:t>
+      </w:r>
+      <w:r>
+        <w:t xml:space="preserve"> </w:t>
+      </w:r>
+      <w:r>
+        <w:rPr>
+          <w:b/>
+          <w:bCs/>
+        </w:rPr>
+        <w:t xml:space="preserve">madurez</w:t>
+      </w:r>
+      <w:r>
+        <w:t xml:space="preserve"> </w:t>
+      </w:r>
+      <w:r>
+        <w:t xml:space="preserve">de la sección 5 se apoya en evidencia que fue apareciendo en las secciones 1 a 4.</w:t>
+      </w:r>
+    </w:p>
+    <w:p>
+      <w:pPr>
+        <w:pStyle w:val="FirstParagraph"/>
+      </w:pPr>
+      <w:r>
+        <w:rPr>
+          <w:b/>
+          <w:bCs/>
+        </w:rPr>
+        <w:t xml:space="preserve">Herramientas que no usamos, y por qué</w:t>
+      </w:r>
+    </w:p>
+    <w:tbl>
+      <w:tblPr>
+        <w:tblStyle w:val="Table"/>
+        <w:tblW w:type="pct" w:w="5000"/>
+        <w:tblLayout w:type="fixed"/>
+        <w:tblLook w:firstRow="1" w:lastRow="0" w:firstColumn="0" w:lastColumn="0" w:noHBand="0" w:noVBand="0" w:val="0020"/>
+      </w:tblPr>
+      <w:tblGrid>
+        <w:gridCol w:w="3960"/>
+        <w:gridCol w:w="3960"/>
+      </w:tblGrid>
+      <w:tr>
+        <w:trPr>
+          <w:tblHeader w:val="on"/>
+        </w:trPr>
+        <w:tc>
+          <w:tcPr/>
+          <w:p>
+            <w:pPr>
+              <w:pStyle w:val="Compact"/>
+            </w:pPr>
+            <w:r>
+              <w:t xml:space="preserve">Herramienta</w:t>
+            </w:r>
+          </w:p>
+        </w:tc>
+        <w:tc>
+          <w:tcPr/>
+          <w:p>
+            <w:pPr>
+              <w:pStyle w:val="Compact"/>
+            </w:pPr>
+            <w:r>
+              <w:t xml:space="preserve">Por qué la dejamos afuera</w:t>
+            </w:r>
+          </w:p>
+        </w:tc>
+      </w:tr>
+      <w:tr>
+        <w:tc>
+          <w:tcPr/>
+          <w:p>
+            <w:pPr>
+              <w:pStyle w:val="Compact"/>
+            </w:pPr>
+            <w:r>
+              <w:t xml:space="preserve">Hipótesis de Oportunidad Tecnológica</w:t>
+            </w:r>
+          </w:p>
+        </w:tc>
+        <w:tc>
+          <w:tcPr/>
+          <w:p>
+            <w:pPr>
+              <w:pStyle w:val="Compact"/>
+            </w:pPr>
+            <w:r>
+              <w:t xml:space="preserve">Es una propuesta de solución (To-Be) y este trabajo es diagnóstico del estado actual (AS-IS)</w:t>
+            </w:r>
+          </w:p>
+        </w:tc>
+      </w:tr>
+      <w:tr>
+        <w:tc>
+          <w:tcPr/>
+          <w:p>
+            <w:pPr>
+              <w:pStyle w:val="Compact"/>
+            </w:pPr>
+            <w:r>
+              <w:t xml:space="preserve">Business Model Canvas en versión To-Be</w:t>
+            </w:r>
+          </w:p>
+        </w:tc>
+        <w:tc>
+          <w:tcPr/>
+          <w:p>
+            <w:pPr>
+              <w:pStyle w:val="Compact"/>
+            </w:pPr>
+            <w:r>
+              <w:t xml:space="preserve">Mismo motivo: el enunciado pide el modelo actual, no el propuesto</w:t>
+            </w:r>
+          </w:p>
+        </w:tc>
+      </w:tr>
+      <w:tr>
+        <w:tc>
+          <w:tcPr/>
+          <w:p>
+            <w:pPr>
+              <w:pStyle w:val="Compact"/>
+            </w:pPr>
+            <w:r>
+              <w:t xml:space="preserve">Balanced Scorecard y OKR</w:t>
+            </w:r>
+          </w:p>
+        </w:tc>
+        <w:tc>
+          <w:tcPr/>
+          <w:p>
+            <w:pPr>
+              <w:pStyle w:val="Compact"/>
+            </w:pPr>
+            <w:r>
+              <w:t xml:space="preserve">Corresponden al Hito 3, no a esta entrega</w:t>
+            </w:r>
+          </w:p>
+        </w:tc>
+      </w:tr>
+      <w:tr>
+        <w:tc>
+          <w:tcPr/>
+          <w:p>
+            <w:pPr>
+              <w:pStyle w:val="Compact"/>
+            </w:pPr>
+            <w:r>
+              <w:t xml:space="preserve">Design Thinking</w:t>
+            </w:r>
+          </w:p>
+        </w:tc>
+        <w:tc>
+          <w:tcPr/>
+          <w:p>
+            <w:pPr>
+              <w:pStyle w:val="Compact"/>
+            </w:pPr>
+            <w:r>
+              <w:t xml:space="preserve">Se vio en la Clase 3 pero apunta a idear soluciones, que todavía no toca</w:t>
+            </w:r>
+          </w:p>
+        </w:tc>
+      </w:tr>
+      <w:tr>
+        <w:tc>
+          <w:tcPr/>
+          <w:p>
+            <w:pPr>
+              <w:pStyle w:val="Compact"/>
+            </w:pPr>
+            <w:r>
+              <w:t xml:space="preserve">Plantilla canónica del problema gerencial</w:t>
+            </w:r>
+          </w:p>
+        </w:tc>
+        <w:tc>
+          <w:tcPr/>
+          <w:p>
+            <w:pPr>
+              <w:pStyle w:val="Compact"/>
+            </w:pPr>
+            <w:r>
+              <w:t xml:space="preserve">Es para la sección 6, que entregamos aparte</w:t>
+            </w:r>
+          </w:p>
+        </w:tc>
+      </w:tr>
+    </w:tbl>
     <w:bookmarkEnd w:id="67"/>
+    <w:bookmarkEnd w:id="68"/>
     <w:sectPr>
       <w:footnotePr>
         <w:numRestart w:val="eachSect"/>
@@ -10125,6 +11398,9 @@
     <w:abstractNumId w:val="991"/>
   </w:num>
   <w:num w:numId="1018">
+    <w:abstractNumId w:val="991"/>
+  </w:num>
+  <w:num w:numId="1019">
     <w:abstractNumId w:val="991"/>
   </w:num>
 </w:numbering>

</xml_diff>

<commit_message>
Aclarar qué herramientas usamos y cuáles no, en una sola tabla
Dos correcciones sobre el commit anterior:

- Sacar el tono de "el enunciado deja elegir, así que elegimos", que suena a
  justificar un atajo citando el reglamento. El criterio ahora se enuncia por
  lo que es: aplicamos la herramienta cuando producía evidencia sobre esta
  empresa, y la dejamos afuera cuando devolvía casilleros vacíos o cuando su
  resultado pertenece a una etapa posterior.
- No quedaba claro cuáles se usaron y cuáles no. herramientas.md ahora abre
  con una tabla única de 16 filas con tres columnas —herramienta, si la usamos
  y por qué— más una segunda tabla de qué se usó en cada sección. Eso se
  replica en la planilla, en el anexo II del informe y en los dos artifacts.

Co-Authored-By: Claude Opus 5 (1M context) <noreply@anthropic.com>
</commit_message>
<xml_diff>
--- a/Material Campus/Proyecto Final/Proyecto/Entrega/TP Final Parte 1 - Dulxelitos.docx
+++ b/Material Campus/Proyecto Final/Proyecto/Entrega/TP Final Parte 1 - Dulxelitos.docx
@@ -150,7 +150,7 @@
         <w:t xml:space="preserve"> </w:t>
       </w:r>
       <w:r>
-        <w:t xml:space="preserve">está el detalle de qué herramienta aplicamos en cada sección, cuáles decidimos no usar y por qué, y cómo se encadenan entre sí.</w:t>
+        <w:t xml:space="preserve">está el detalle de qué herramienta usamos en cada sección, cuáles no y por qué, y cómo se encadenan entre sí.</w:t>
       </w:r>
     </w:p>
     <w:p>
@@ -991,30 +991,29 @@
           <w:b/>
           <w:bCs/>
         </w:rPr>
-        <w:t xml:space="preserve">Dos herramientas que decidimos no usar, y por qué.</w:t>
+        <w:t xml:space="preserve">Por qué estas tres y no otras.</w:t>
       </w:r>
       <w:r>
         <w:t xml:space="preserve"> </w:t>
       </w:r>
       <w:r>
-        <w:t xml:space="preserve">El enunciado pide</w:t>
-      </w:r>
-      <w:r>
-        <w:t xml:space="preserve"> </w:t>
-      </w:r>
-      <w:r>
-        <w:t xml:space="preserve">“FODA, PESTEL, cinco fuerzas u otra herramienta equivalente”</w:t>
-      </w:r>
-      <w:r>
-        <w:t xml:space="preserve">, o sea que deja elegir.</w:t>
-      </w:r>
-    </w:p>
-    <w:p>
-      <w:pPr>
-        <w:pStyle w:val="BodyText"/>
-      </w:pPr>
-      <w:r>
-        <w:t xml:space="preserve">No hicimos un</w:t>
+        <w:t xml:space="preserve">El criterio que seguimos fue simple: aplicamos una herramienta cuando producía evidencia sobre esta empresa en particular, y la dejamos afuera cuando devolvía casilleros vacíos o cuando su resultado pertenece a una etapa posterior del proyecto.</w:t>
+      </w:r>
+    </w:p>
+    <w:p>
+      <w:pPr>
+        <w:pStyle w:val="BodyText"/>
+      </w:pPr>
+      <w:r>
+        <w:t xml:space="preserve">Con ese criterio quedaron afuera dos que podrían esperarse acá.</w:t>
+      </w:r>
+    </w:p>
+    <w:p>
+      <w:pPr>
+        <w:pStyle w:val="BodyText"/>
+      </w:pPr>
+      <w:r>
+        <w:t xml:space="preserve">La primera es el</w:t>
       </w:r>
       <w:r>
         <w:t xml:space="preserve"> </w:t>
@@ -1027,7 +1026,7 @@
         <w:t xml:space="preserve">PESTEL completo</w:t>
       </w:r>
       <w:r>
-        <w:t xml:space="preserve">. Lo probamos y cuatro de sus seis dimensiones volvían vacías: ninguna regulación los complicó, la presión ecológica no se siente, lo legal se pisa con lo político y lo tecnológico ya lo mide la sección 5 con mucho más rigor. Llenar seis casilleros para que cuatro digan</w:t>
+        <w:t xml:space="preserve">. Lo aplicamos y cuatro de sus seis dimensiones no tenían impacto real sobre esta empresa: ninguna regulación los complicó, la presión ecológica no se siente, lo legal se pisa con lo político y lo tecnológico ya lo mide la sección 5 con mucho más rigor. Un cuadro donde cuatro de seis casilleros dicen</w:t>
       </w:r>
       <w:r>
         <w:t xml:space="preserve"> </w:t>
@@ -1039,15 +1038,15 @@
         <w:t xml:space="preserve"> </w:t>
       </w:r>
       <w:r>
-        <w:t xml:space="preserve">es exactamente lo que la guía de la cátedra advierte cuando pregunta cuál es la diferencia entre listar un factor PESTEL y explicar su impacto real en la empresa. Así que nos quedamos con los factores que sí impactan, y los desarrollamos en 2.1.</w:t>
-      </w:r>
-    </w:p>
-    <w:p>
-      <w:pPr>
-        <w:pStyle w:val="BodyText"/>
-      </w:pPr>
-      <w:r>
-        <w:t xml:space="preserve">Tampoco hicimos el</w:t>
+        <w:t xml:space="preserve">no aporta al diagnóstico y sí distrae de lo que importa. La guía de la cátedra apunta a lo mismo cuando pregunta qué diferencia hay entre listar un factor PESTEL y explicar su impacto real en la empresa, y su propio ejemplo resuelto trabaja con factores clave en vez de con la matriz completa. Así que nos quedamos con los factores que sí impactan, y los desarrollamos en 2.1.</w:t>
+      </w:r>
+    </w:p>
+    <w:p>
+      <w:pPr>
+        <w:pStyle w:val="BodyText"/>
+      </w:pPr>
+      <w:r>
+        <w:t xml:space="preserve">La segunda es el</w:t>
       </w:r>
       <w:r>
         <w:t xml:space="preserve"> </w:t>
@@ -1060,7 +1059,27 @@
         <w:t xml:space="preserve">FODA cruzado</w:t>
       </w:r>
       <w:r>
-        <w:t xml:space="preserve">. El cruce sirve para derivar iniciativas, y esta entrega es diagnóstico: el enunciado es explícito en que todavía no hay que proponer solución. El FODA simple sí lo hicimos, porque el enunciado pide oportunidades y amenazas, y porque es la forma que usa la guía de la cátedra en su ejemplo resuelto.</w:t>
+        <w:t xml:space="preserve">. El cruce sirve para derivar iniciativas de acción, y esta entrega es diagnóstico: el enunciado pide explícitamente no proponer solución todavía, y la Clase 3 advierte que la rúbrica penaliza el sesgo de la solución preconcebida. El FODA simple sí lo hicimos, porque el enunciado pide oportunidades y amenazas, y porque es la forma que usa la guía de la cátedra en su ejemplo.</w:t>
+      </w:r>
+    </w:p>
+    <w:p>
+      <w:pPr>
+        <w:pStyle w:val="BodyText"/>
+      </w:pPr>
+      <w:r>
+        <w:t xml:space="preserve">El detalle completo de qué herramienta usamos en cada sección y cuáles quedaron afuera está en el documento</w:t>
+      </w:r>
+      <w:r>
+        <w:t xml:space="preserve"> </w:t>
+      </w:r>
+      <w:r>
+        <w:rPr>
+          <w:rStyle w:val="VerbatimChar"/>
+        </w:rPr>
+        <w:t xml:space="preserve">herramientas.md</w:t>
+      </w:r>
+      <w:r>
+        <w:t xml:space="preserve">.</w:t>
       </w:r>
     </w:p>
     <w:bookmarkStart w:id="18" w:name="los-factores-del-entorno-que-sí-impactan"/>
@@ -9130,7 +9149,7 @@
       </w:r>
     </w:p>
     <w:bookmarkEnd w:id="64"/>
-    <w:bookmarkStart w:id="68" w:name="anexos"/>
+    <w:bookmarkStart w:id="67" w:name="anexos"/>
     <w:p>
       <w:pPr>
         <w:pStyle w:val="Heading1"/>
@@ -9437,7 +9456,7 @@
       </w:r>
     </w:p>
     <w:bookmarkEnd w:id="65"/>
-    <w:bookmarkStart w:id="67" w:name="Xb847e54c146f6c28789d967e367bf46cf8beba9"/>
+    <w:bookmarkStart w:id="66" w:name="Xb847e54c146f6c28789d967e367bf46cf8beba9"/>
     <w:p>
       <w:pPr>
         <w:pStyle w:val="Heading2"/>
@@ -9455,7 +9474,27 @@
           <w:b/>
           <w:bCs/>
         </w:rPr>
-        <w:t xml:space="preserve">Cuadro general</w:t>
+        <w:t xml:space="preserve">El criterio</w:t>
+      </w:r>
+    </w:p>
+    <w:p>
+      <w:pPr>
+        <w:pStyle w:val="BodyText"/>
+      </w:pPr>
+      <w:r>
+        <w:t xml:space="preserve">Aplicamos una herramienta cuando producía evidencia sobre esta empresa en particular. La dejamos afuera cuando devolvía casilleros vacíos, cuando se superponía con otra que hacía el mismo trabajo mejor, o cuando su resultado pertenece a una etapa posterior del proyecto.</w:t>
+      </w:r>
+    </w:p>
+    <w:p>
+      <w:pPr>
+        <w:pStyle w:val="BodyText"/>
+      </w:pPr>
+      <w:r>
+        <w:rPr>
+          <w:b/>
+          <w:bCs/>
+        </w:rPr>
+        <w:t xml:space="preserve">La lista completa</w:t>
       </w:r>
     </w:p>
     <w:tbl>
@@ -9466,11 +9505,9 @@
         <w:tblLook w:firstRow="1" w:lastRow="0" w:firstColumn="0" w:lastColumn="0" w:noHBand="0" w:noVBand="0" w:val="0020"/>
       </w:tblPr>
       <w:tblGrid>
-        <w:gridCol w:w="1218"/>
-        <w:gridCol w:w="1566"/>
-        <w:gridCol w:w="1392"/>
-        <w:gridCol w:w="2523"/>
-        <w:gridCol w:w="1218"/>
+        <w:gridCol w:w="2980"/>
+        <w:gridCol w:w="681"/>
+        <w:gridCol w:w="4258"/>
       </w:tblGrid>
       <w:tr>
         <w:trPr>
@@ -9483,17 +9520,6 @@
               <w:pStyle w:val="Compact"/>
             </w:pPr>
             <w:r>
-              <w:t xml:space="preserve">Sección</w:t>
-            </w:r>
-          </w:p>
-        </w:tc>
-        <w:tc>
-          <w:tcPr/>
-          <w:p>
-            <w:pPr>
-              <w:pStyle w:val="Compact"/>
-            </w:pPr>
-            <w:r>
               <w:t xml:space="preserve">Herramienta</w:t>
             </w:r>
           </w:p>
@@ -9503,101 +9529,26 @@
           <w:p>
             <w:pPr>
               <w:pStyle w:val="Compact"/>
-            </w:pPr>
-            <w:r>
-              <w:t xml:space="preserve">Autor / origen</w:t>
-            </w:r>
-          </w:p>
-        </w:tc>
-        <w:tc>
-          <w:tcPr/>
-          <w:p>
-            <w:pPr>
-              <w:pStyle w:val="Compact"/>
-            </w:pPr>
-            <w:r>
-              <w:t xml:space="preserve">Para qué la usamos</w:t>
-            </w:r>
-          </w:p>
-        </w:tc>
-        <w:tc>
-          <w:tcPr/>
-          <w:p>
-            <w:pPr>
-              <w:pStyle w:val="Compact"/>
-            </w:pPr>
-            <w:r>
-              <w:t xml:space="preserve">Dónde la vimos</w:t>
-            </w:r>
-          </w:p>
-        </w:tc>
-      </w:tr>
-      <w:tr>
-        <w:tc>
-          <w:tcPr/>
-          <w:p>
-            <w:pPr>
-              <w:pStyle w:val="Compact"/>
-            </w:pPr>
-            <w:r>
-              <w:t xml:space="preserve">1. La organización</w:t>
-            </w:r>
-          </w:p>
-        </w:tc>
-        <w:tc>
-          <w:tcPr/>
-          <w:p>
-            <w:pPr>
-              <w:pStyle w:val="Compact"/>
-            </w:pPr>
-            <w:r>
-              <w:t xml:space="preserve">No aplica</w:t>
-            </w:r>
-          </w:p>
-        </w:tc>
-        <w:tc>
-          <w:tcPr/>
-          <w:p>
-            <w:pPr>
-              <w:pStyle w:val="Compact"/>
-            </w:pPr>
-          </w:p>
-        </w:tc>
-        <w:tc>
-          <w:tcPr/>
-          <w:p>
-            <w:pPr>
-              <w:pStyle w:val="Compact"/>
-            </w:pPr>
-            <w:r>
-              <w:t xml:space="preserve">Es relevamiento descriptivo. Seguimos la estructura que pide el enunciado</w:t>
-            </w:r>
-          </w:p>
-        </w:tc>
-        <w:tc>
-          <w:tcPr/>
-          <w:p>
-            <w:pPr>
-              <w:pStyle w:val="Compact"/>
-            </w:pPr>
-            <w:r>
-              <w:t xml:space="preserve">Enunciado del TP</w:t>
-            </w:r>
-          </w:p>
-        </w:tc>
-      </w:tr>
-      <w:tr>
-        <w:tc>
-          <w:tcPr/>
-          <w:p>
-            <w:pPr>
-              <w:pStyle w:val="Compact"/>
-            </w:pPr>
-            <w:r>
-              <w:t xml:space="preserve">2. El contexto</w:t>
-            </w:r>
-          </w:p>
-        </w:tc>
+              <w:jc w:val="center"/>
+            </w:pPr>
+            <w:r>
+              <w:t xml:space="preserve">¿La usamos?</w:t>
+            </w:r>
+          </w:p>
+        </w:tc>
+        <w:tc>
+          <w:tcPr/>
+          <w:p>
+            <w:pPr>
+              <w:pStyle w:val="Compact"/>
+            </w:pPr>
+            <w:r>
+              <w:t xml:space="preserve">Por qué</w:t>
+            </w:r>
+          </w:p>
+        </w:tc>
+      </w:tr>
+      <w:tr>
         <w:tc>
           <w:tcPr/>
           <w:p>
@@ -9614,104 +9565,70 @@
           <w:p>
             <w:pPr>
               <w:pStyle w:val="Compact"/>
-            </w:pPr>
-            <w:r>
-              <w:t xml:space="preserve">Adaptado de PESTEL</w:t>
-            </w:r>
-          </w:p>
-        </w:tc>
-        <w:tc>
-          <w:tcPr/>
-          <w:p>
-            <w:pPr>
-              <w:pStyle w:val="Compact"/>
-            </w:pPr>
-            <w:r>
-              <w:t xml:space="preserve">Tomar las restricciones económicas, regulatorias, sociales y tecnológicas que el enunciado pide, pero contando qué le hace cada una a esta empresa</w:t>
-            </w:r>
-          </w:p>
-        </w:tc>
-        <w:tc>
-          <w:tcPr/>
-          <w:p>
-            <w:pPr>
-              <w:pStyle w:val="Compact"/>
-            </w:pPr>
-            <w:r>
-              <w:t xml:space="preserve">Clase 2 y guía de la cátedra</w:t>
-            </w:r>
-          </w:p>
-        </w:tc>
-      </w:tr>
-      <w:tr>
-        <w:tc>
-          <w:tcPr/>
-          <w:p>
-            <w:pPr>
-              <w:pStyle w:val="Compact"/>
-            </w:pPr>
-            <w:r>
-              <w:t xml:space="preserve">2. El contexto</w:t>
-            </w:r>
-          </w:p>
-        </w:tc>
-        <w:tc>
-          <w:tcPr/>
-          <w:p>
-            <w:pPr>
-              <w:pStyle w:val="Compact"/>
-            </w:pPr>
-            <w:r>
-              <w:t xml:space="preserve">Cinco fuerzas</w:t>
-            </w:r>
-          </w:p>
-        </w:tc>
-        <w:tc>
-          <w:tcPr/>
-          <w:p>
-            <w:pPr>
-              <w:pStyle w:val="Compact"/>
-            </w:pPr>
-            <w:r>
-              <w:t xml:space="preserve">Porter (1979, 1980)</w:t>
-            </w:r>
-          </w:p>
-        </w:tc>
-        <w:tc>
-          <w:tcPr/>
-          <w:p>
-            <w:pPr>
-              <w:pStyle w:val="Compact"/>
-            </w:pPr>
-            <w:r>
-              <w:t xml:space="preserve">Analizar el sector: rivalidad, proveedores, compradores, entrantes y sustitutos</w:t>
-            </w:r>
-          </w:p>
-        </w:tc>
-        <w:tc>
-          <w:tcPr/>
-          <w:p>
-            <w:pPr>
-              <w:pStyle w:val="Compact"/>
-            </w:pPr>
-            <w:r>
-              <w:t xml:space="preserve">Clase 2</w:t>
-            </w:r>
-          </w:p>
-        </w:tc>
-      </w:tr>
-      <w:tr>
-        <w:tc>
-          <w:tcPr/>
-          <w:p>
-            <w:pPr>
-              <w:pStyle w:val="Compact"/>
-            </w:pPr>
-            <w:r>
-              <w:t xml:space="preserve">2. El contexto</w:t>
-            </w:r>
-          </w:p>
-        </w:tc>
+              <w:jc w:val="center"/>
+            </w:pPr>
+            <w:r>
+              <w:rPr>
+                <w:b/>
+                <w:bCs/>
+              </w:rPr>
+              <w:t xml:space="preserve">Sí</w:t>
+            </w:r>
+          </w:p>
+        </w:tc>
+        <w:tc>
+          <w:tcPr/>
+          <w:p>
+            <w:pPr>
+              <w:pStyle w:val="Compact"/>
+            </w:pPr>
+            <w:r>
+              <w:t xml:space="preserve">Cubre las restricciones económicas, regulatorias, sociales y tecnológicas que pide el enunciado, contando qué le hace cada una a esta empresa</w:t>
+            </w:r>
+          </w:p>
+        </w:tc>
+      </w:tr>
+      <w:tr>
+        <w:tc>
+          <w:tcPr/>
+          <w:p>
+            <w:pPr>
+              <w:pStyle w:val="Compact"/>
+            </w:pPr>
+            <w:r>
+              <w:t xml:space="preserve">Cinco fuerzas de Porter</w:t>
+            </w:r>
+          </w:p>
+        </w:tc>
+        <w:tc>
+          <w:tcPr/>
+          <w:p>
+            <w:pPr>
+              <w:pStyle w:val="Compact"/>
+              <w:jc w:val="center"/>
+            </w:pPr>
+            <w:r>
+              <w:rPr>
+                <w:b/>
+                <w:bCs/>
+              </w:rPr>
+              <w:t xml:space="preserve">Sí</w:t>
+            </w:r>
+          </w:p>
+        </w:tc>
+        <w:tc>
+          <w:tcPr/>
+          <w:p>
+            <w:pPr>
+              <w:pStyle w:val="Compact"/>
+            </w:pPr>
+            <w:r>
+              <w:t xml:space="preserve">Es lo que explica por qué el sector nunca los obligó a cambiar, y lo que detecta la dependencia del proveedor único</w:t>
+            </w:r>
+          </w:p>
+        </w:tc>
+      </w:tr>
+      <w:tr>
         <w:tc>
           <w:tcPr/>
           <w:p>
@@ -9728,47 +9645,30 @@
           <w:p>
             <w:pPr>
               <w:pStyle w:val="Compact"/>
-            </w:pPr>
-            <w:r>
-              <w:t xml:space="preserve">Porter (1985)</w:t>
-            </w:r>
-          </w:p>
-        </w:tc>
-        <w:tc>
-          <w:tcPr/>
-          <w:p>
-            <w:pPr>
-              <w:pStyle w:val="Compact"/>
-            </w:pPr>
-            <w:r>
-              <w:t xml:space="preserve">Ver dónde se crea y dónde se pierde margen puertas adentro</w:t>
-            </w:r>
-          </w:p>
-        </w:tc>
-        <w:tc>
-          <w:tcPr/>
-          <w:p>
-            <w:pPr>
-              <w:pStyle w:val="Compact"/>
-            </w:pPr>
-            <w:r>
-              <w:t xml:space="preserve">Clase 2 (aparece también en la Clase 1)</w:t>
-            </w:r>
-          </w:p>
-        </w:tc>
-      </w:tr>
-      <w:tr>
-        <w:tc>
-          <w:tcPr/>
-          <w:p>
-            <w:pPr>
-              <w:pStyle w:val="Compact"/>
-            </w:pPr>
-            <w:r>
-              <w:t xml:space="preserve">2. El contexto</w:t>
-            </w:r>
-          </w:p>
-        </w:tc>
+              <w:jc w:val="center"/>
+            </w:pPr>
+            <w:r>
+              <w:rPr>
+                <w:b/>
+                <w:bCs/>
+              </w:rPr>
+              <w:t xml:space="preserve">Sí</w:t>
+            </w:r>
+          </w:p>
+        </w:tc>
+        <w:tc>
+          <w:tcPr/>
+          <w:p>
+            <w:pPr>
+              <w:pStyle w:val="Compact"/>
+            </w:pPr>
+            <w:r>
+              <w:t xml:space="preserve">Muestra dónde se crea y dónde se pierde el margen puertas adentro</w:t>
+            </w:r>
+          </w:p>
+        </w:tc>
+      </w:tr>
+      <w:tr>
         <w:tc>
           <w:tcPr/>
           <w:p>
@@ -9785,47 +9685,30 @@
           <w:p>
             <w:pPr>
               <w:pStyle w:val="Compact"/>
-            </w:pPr>
-            <w:r>
-              <w:t xml:space="preserve">Herramienta clásica de planeamiento</w:t>
-            </w:r>
-          </w:p>
-        </w:tc>
-        <w:tc>
-          <w:tcPr/>
-          <w:p>
-            <w:pPr>
-              <w:pStyle w:val="Compact"/>
-            </w:pPr>
-            <w:r>
-              <w:t xml:space="preserve">Sintetizar lo interno y lo externo en un solo cuadro</w:t>
-            </w:r>
-          </w:p>
-        </w:tc>
-        <w:tc>
-          <w:tcPr/>
-          <w:p>
-            <w:pPr>
-              <w:pStyle w:val="Compact"/>
-            </w:pPr>
-            <w:r>
-              <w:t xml:space="preserve">Clase 2 y guía de la cátedra</w:t>
-            </w:r>
-          </w:p>
-        </w:tc>
-      </w:tr>
-      <w:tr>
-        <w:tc>
-          <w:tcPr/>
-          <w:p>
-            <w:pPr>
-              <w:pStyle w:val="Compact"/>
-            </w:pPr>
-            <w:r>
-              <w:t xml:space="preserve">3. Modelo de negocio</w:t>
-            </w:r>
-          </w:p>
-        </w:tc>
+              <w:jc w:val="center"/>
+            </w:pPr>
+            <w:r>
+              <w:rPr>
+                <w:b/>
+                <w:bCs/>
+              </w:rPr>
+              <w:t xml:space="preserve">Sí</w:t>
+            </w:r>
+          </w:p>
+        </w:tc>
+        <w:tc>
+          <w:tcPr/>
+          <w:p>
+            <w:pPr>
+              <w:pStyle w:val="Compact"/>
+            </w:pPr>
+            <w:r>
+              <w:t xml:space="preserve">El enunciado pide oportunidades y amenazas, y sintetiza lo interno con lo externo en un solo cuadro</w:t>
+            </w:r>
+          </w:p>
+        </w:tc>
+      </w:tr>
+      <w:tr>
         <w:tc>
           <w:tcPr/>
           <w:p>
@@ -9842,104 +9725,70 @@
           <w:p>
             <w:pPr>
               <w:pStyle w:val="Compact"/>
-            </w:pPr>
-            <w:r>
-              <w:t xml:space="preserve">Osterwalder y Pigneur (2010)</w:t>
-            </w:r>
-          </w:p>
-        </w:tc>
-        <w:tc>
-          <w:tcPr/>
-          <w:p>
-            <w:pPr>
-              <w:pStyle w:val="Compact"/>
-            </w:pPr>
-            <w:r>
-              <w:t xml:space="preserve">Describir cómo la empresa crea, entrega y captura valor hoy</w:t>
-            </w:r>
-          </w:p>
-        </w:tc>
-        <w:tc>
-          <w:tcPr/>
-          <w:p>
-            <w:pPr>
-              <w:pStyle w:val="Compact"/>
-            </w:pPr>
-            <w:r>
-              <w:t xml:space="preserve">Clase 2</w:t>
-            </w:r>
-          </w:p>
-        </w:tc>
-      </w:tr>
-      <w:tr>
-        <w:tc>
-          <w:tcPr/>
-          <w:p>
-            <w:pPr>
-              <w:pStyle w:val="Compact"/>
-            </w:pPr>
-            <w:r>
-              <w:t xml:space="preserve">3. Modelo de negocio</w:t>
-            </w:r>
-          </w:p>
-        </w:tc>
-        <w:tc>
-          <w:tcPr/>
-          <w:p>
-            <w:pPr>
-              <w:pStyle w:val="Compact"/>
-            </w:pPr>
-            <w:r>
-              <w:t xml:space="preserve">Explotación y exploración (Run / Change the Business)</w:t>
-            </w:r>
-          </w:p>
-        </w:tc>
-        <w:tc>
-          <w:tcPr/>
-          <w:p>
-            <w:pPr>
-              <w:pStyle w:val="Compact"/>
-            </w:pPr>
-            <w:r>
-              <w:t xml:space="preserve">Enfoque bimodal de la materia</w:t>
-            </w:r>
-          </w:p>
-        </w:tc>
-        <w:tc>
-          <w:tcPr/>
-          <w:p>
-            <w:pPr>
-              <w:pStyle w:val="Compact"/>
-            </w:pPr>
-            <w:r>
-              <w:t xml:space="preserve">Separar lo que sostiene la operación de lo que la transforma</w:t>
-            </w:r>
-          </w:p>
-        </w:tc>
-        <w:tc>
-          <w:tcPr/>
-          <w:p>
-            <w:pPr>
-              <w:pStyle w:val="Compact"/>
-            </w:pPr>
-            <w:r>
-              <w:t xml:space="preserve">Presentación introductoria y Clase 3</w:t>
-            </w:r>
-          </w:p>
-        </w:tc>
-      </w:tr>
-      <w:tr>
-        <w:tc>
-          <w:tcPr/>
-          <w:p>
-            <w:pPr>
-              <w:pStyle w:val="Compact"/>
-            </w:pPr>
-            <w:r>
-              <w:t xml:space="preserve">3. Modelo de negocio</w:t>
-            </w:r>
-          </w:p>
-        </w:tc>
+              <w:jc w:val="center"/>
+            </w:pPr>
+            <w:r>
+              <w:rPr>
+                <w:b/>
+                <w:bCs/>
+              </w:rPr>
+              <w:t xml:space="preserve">Sí</w:t>
+            </w:r>
+          </w:p>
+        </w:tc>
+        <w:tc>
+          <w:tcPr/>
+          <w:p>
+            <w:pPr>
+              <w:pStyle w:val="Compact"/>
+            </w:pPr>
+            <w:r>
+              <w:t xml:space="preserve">Lo pide el enunciado. Describe cómo la empresa crea, entrega y captura valor hoy</w:t>
+            </w:r>
+          </w:p>
+        </w:tc>
+      </w:tr>
+      <w:tr>
+        <w:tc>
+          <w:tcPr/>
+          <w:p>
+            <w:pPr>
+              <w:pStyle w:val="Compact"/>
+            </w:pPr>
+            <w:r>
+              <w:t xml:space="preserve">Explotación y exploración (Run / Change)</w:t>
+            </w:r>
+          </w:p>
+        </w:tc>
+        <w:tc>
+          <w:tcPr/>
+          <w:p>
+            <w:pPr>
+              <w:pStyle w:val="Compact"/>
+              <w:jc w:val="center"/>
+            </w:pPr>
+            <w:r>
+              <w:rPr>
+                <w:b/>
+                <w:bCs/>
+              </w:rPr>
+              <w:t xml:space="preserve">Sí</w:t>
+            </w:r>
+          </w:p>
+        </w:tc>
+        <w:tc>
+          <w:tcPr/>
+          <w:p>
+            <w:pPr>
+              <w:pStyle w:val="Compact"/>
+            </w:pPr>
+            <w:r>
+              <w:t xml:space="preserve">Es el eje bimodal de la materia y expone el desbalance del modelo</w:t>
+            </w:r>
+          </w:p>
+        </w:tc>
+      </w:tr>
+      <w:tr>
         <w:tc>
           <w:tcPr/>
           <w:p>
@@ -9956,47 +9805,30 @@
           <w:p>
             <w:pPr>
               <w:pStyle w:val="Compact"/>
-            </w:pPr>
-            <w:r>
-              <w:t xml:space="preserve">Porter (1980)</w:t>
-            </w:r>
-          </w:p>
-        </w:tc>
-        <w:tc>
-          <w:tcPr/>
-          <w:p>
-            <w:pPr>
-              <w:pStyle w:val="Compact"/>
-            </w:pPr>
-            <w:r>
-              <w:t xml:space="preserve">Definir cuál es la ventaja competitiva real de la empresa</w:t>
-            </w:r>
-          </w:p>
-        </w:tc>
-        <w:tc>
-          <w:tcPr/>
-          <w:p>
-            <w:pPr>
-              <w:pStyle w:val="Compact"/>
-            </w:pPr>
-            <w:r>
-              <w:t xml:space="preserve">Clase 2</w:t>
-            </w:r>
-          </w:p>
-        </w:tc>
-      </w:tr>
-      <w:tr>
-        <w:tc>
-          <w:tcPr/>
-          <w:p>
-            <w:pPr>
-              <w:pStyle w:val="Compact"/>
-            </w:pPr>
-            <w:r>
-              <w:t xml:space="preserve">4. Propuesta de valor</w:t>
-            </w:r>
-          </w:p>
-        </w:tc>
+              <w:jc w:val="center"/>
+            </w:pPr>
+            <w:r>
+              <w:rPr>
+                <w:b/>
+                <w:bCs/>
+              </w:rPr>
+              <w:t xml:space="preserve">Sí</w:t>
+            </w:r>
+          </w:p>
+        </w:tc>
+        <w:tc>
+          <w:tcPr/>
+          <w:p>
+            <w:pPr>
+              <w:pStyle w:val="Compact"/>
+            </w:pPr>
+            <w:r>
+              <w:t xml:space="preserve">Define cuál es la ventaja competitiva real de la empresa</w:t>
+            </w:r>
+          </w:p>
+        </w:tc>
+      </w:tr>
+      <w:tr>
         <w:tc>
           <w:tcPr/>
           <w:p>
@@ -10013,47 +9845,30 @@
           <w:p>
             <w:pPr>
               <w:pStyle w:val="Compact"/>
-            </w:pPr>
-            <w:r>
-              <w:t xml:space="preserve">Osterwalder, Pigneur, Bernarda y Smith (2014)</w:t>
-            </w:r>
-          </w:p>
-        </w:tc>
-        <w:tc>
-          <w:tcPr/>
-          <w:p>
-            <w:pPr>
-              <w:pStyle w:val="Compact"/>
-            </w:pPr>
-            <w:r>
-              <w:t xml:space="preserve">Cruzar lo que el cliente necesita con lo que la empresa ofrece, y medir el encaje</w:t>
-            </w:r>
-          </w:p>
-        </w:tc>
-        <w:tc>
-          <w:tcPr/>
-          <w:p>
-            <w:pPr>
-              <w:pStyle w:val="Compact"/>
-            </w:pPr>
-            <w:r>
-              <w:t xml:space="preserve">Clase 2</w:t>
-            </w:r>
-          </w:p>
-        </w:tc>
-      </w:tr>
-      <w:tr>
-        <w:tc>
-          <w:tcPr/>
-          <w:p>
-            <w:pPr>
-              <w:pStyle w:val="Compact"/>
-            </w:pPr>
-            <w:r>
-              <w:t xml:space="preserve">5. Madurez</w:t>
-            </w:r>
-          </w:p>
-        </w:tc>
+              <w:jc w:val="center"/>
+            </w:pPr>
+            <w:r>
+              <w:rPr>
+                <w:b/>
+                <w:bCs/>
+              </w:rPr>
+              <w:t xml:space="preserve">Sí</w:t>
+            </w:r>
+          </w:p>
+        </w:tc>
+        <w:tc>
+          <w:tcPr/>
+          <w:p>
+            <w:pPr>
+              <w:pStyle w:val="Compact"/>
+            </w:pPr>
+            <w:r>
+              <w:t xml:space="preserve">Lo pide el enunciado. Mide el encaje entre lo que la empresa ofrece y lo que el canal necesita</w:t>
+            </w:r>
+          </w:p>
+        </w:tc>
+      </w:tr>
+      <w:tr>
         <w:tc>
           <w:tcPr/>
           <w:p>
@@ -10070,88 +9885,385 @@
           <w:p>
             <w:pPr>
               <w:pStyle w:val="Compact"/>
-            </w:pPr>
-            <w:r>
-              <w:t xml:space="preserve">Cátedra de Gestión Gerencial</w:t>
-            </w:r>
-          </w:p>
-        </w:tc>
-        <w:tc>
-          <w:tcPr/>
-          <w:p>
-            <w:pPr>
-              <w:pStyle w:val="Compact"/>
-            </w:pPr>
-            <w:r>
-              <w:t xml:space="preserve">Evaluar seis dimensiones con escala A a E, más una séptima que agregamos</w:t>
-            </w:r>
-          </w:p>
-        </w:tc>
-        <w:tc>
-          <w:tcPr/>
-          <w:p>
-            <w:pPr>
-              <w:pStyle w:val="Compact"/>
-            </w:pPr>
-            <w:r>
-              <w:t xml:space="preserve">Material de cátedra</w:t>
-            </w:r>
-          </w:p>
-        </w:tc>
-      </w:tr>
-      <w:tr>
-        <w:tc>
-          <w:tcPr/>
-          <w:p>
-            <w:pPr>
-              <w:pStyle w:val="Compact"/>
-            </w:pPr>
-            <w:r>
-              <w:t xml:space="preserve">5. Madurez</w:t>
-            </w:r>
-          </w:p>
-        </w:tc>
-        <w:tc>
-          <w:tcPr/>
-          <w:p>
-            <w:pPr>
-              <w:pStyle w:val="Compact"/>
-            </w:pPr>
-            <w:r>
-              <w:t xml:space="preserve">Costo de No Actuar (CoI)</w:t>
-            </w:r>
-          </w:p>
-        </w:tc>
-        <w:tc>
-          <w:tcPr/>
-          <w:p>
-            <w:pPr>
-              <w:pStyle w:val="Compact"/>
-            </w:pPr>
-            <w:r>
-              <w:t xml:space="preserve">Fórmula de tres componentes</w:t>
-            </w:r>
-          </w:p>
-        </w:tc>
-        <w:tc>
-          <w:tcPr/>
-          <w:p>
-            <w:pPr>
-              <w:pStyle w:val="Compact"/>
-            </w:pPr>
-            <w:r>
-              <w:t xml:space="preserve">Poner en plata lo que cuesta no resolver cada brecha</w:t>
-            </w:r>
-          </w:p>
-        </w:tc>
-        <w:tc>
-          <w:tcPr/>
-          <w:p>
-            <w:pPr>
-              <w:pStyle w:val="Compact"/>
-            </w:pPr>
-            <w:r>
-              <w:t xml:space="preserve">Clase 3</w:t>
+              <w:jc w:val="center"/>
+            </w:pPr>
+            <w:r>
+              <w:rPr>
+                <w:b/>
+                <w:bCs/>
+              </w:rPr>
+              <w:t xml:space="preserve">Sí</w:t>
+            </w:r>
+          </w:p>
+        </w:tc>
+        <w:tc>
+          <w:tcPr/>
+          <w:p>
+            <w:pPr>
+              <w:pStyle w:val="Compact"/>
+            </w:pPr>
+            <w:r>
+              <w:t xml:space="preserve">Lo pide el enunciado. Es el instrumento con el que se evalúan las capacidades</w:t>
+            </w:r>
+          </w:p>
+        </w:tc>
+      </w:tr>
+      <w:tr>
+        <w:tc>
+          <w:tcPr/>
+          <w:p>
+            <w:pPr>
+              <w:pStyle w:val="Compact"/>
+            </w:pPr>
+            <w:r>
+              <w:t xml:space="preserve">Costo de No Actuar</w:t>
+            </w:r>
+          </w:p>
+        </w:tc>
+        <w:tc>
+          <w:tcPr/>
+          <w:p>
+            <w:pPr>
+              <w:pStyle w:val="Compact"/>
+              <w:jc w:val="center"/>
+            </w:pPr>
+            <w:r>
+              <w:rPr>
+                <w:b/>
+                <w:bCs/>
+              </w:rPr>
+              <w:t xml:space="preserve">Sí</w:t>
+            </w:r>
+          </w:p>
+        </w:tc>
+        <w:tc>
+          <w:tcPr/>
+          <w:p>
+            <w:pPr>
+              <w:pStyle w:val="Compact"/>
+            </w:pPr>
+            <w:r>
+              <w:t xml:space="preserve">Pone en plata lo que cuesta no resolver cada brecha</w:t>
+            </w:r>
+          </w:p>
+        </w:tc>
+      </w:tr>
+      <w:tr>
+        <w:tc>
+          <w:tcPr/>
+          <w:p>
+            <w:pPr>
+              <w:pStyle w:val="Compact"/>
+            </w:pPr>
+            <w:r>
+              <w:rPr>
+                <w:b/>
+                <w:bCs/>
+              </w:rPr>
+              <w:t xml:space="preserve">PESTEL completo</w:t>
+            </w:r>
+          </w:p>
+        </w:tc>
+        <w:tc>
+          <w:tcPr/>
+          <w:p>
+            <w:pPr>
+              <w:pStyle w:val="Compact"/>
+              <w:jc w:val="center"/>
+            </w:pPr>
+            <w:r>
+              <w:rPr>
+                <w:b/>
+                <w:bCs/>
+              </w:rPr>
+              <w:t xml:space="preserve">No</w:t>
+            </w:r>
+          </w:p>
+        </w:tc>
+        <w:tc>
+          <w:tcPr/>
+          <w:p>
+            <w:pPr>
+              <w:pStyle w:val="Compact"/>
+            </w:pPr>
+            <w:r>
+              <w:t xml:space="preserve">Cuatro de sus seis dimensiones no tenían impacto real en este caso. Un cuadro con cuatro casilleros que dicen</w:t>
+            </w:r>
+            <w:r>
+              <w:t xml:space="preserve"> </w:t>
+            </w:r>
+            <w:r>
+              <w:t xml:space="preserve">“sin impacto”</w:t>
+            </w:r>
+            <w:r>
+              <w:t xml:space="preserve"> </w:t>
+            </w:r>
+            <w:r>
+              <w:t xml:space="preserve">no aporta al diagnóstico. En su lugar desarrollamos los factores que sí impactan</w:t>
+            </w:r>
+          </w:p>
+        </w:tc>
+      </w:tr>
+      <w:tr>
+        <w:tc>
+          <w:tcPr/>
+          <w:p>
+            <w:pPr>
+              <w:pStyle w:val="Compact"/>
+            </w:pPr>
+            <w:r>
+              <w:rPr>
+                <w:b/>
+                <w:bCs/>
+              </w:rPr>
+              <w:t xml:space="preserve">FODA cruzado</w:t>
+            </w:r>
+          </w:p>
+        </w:tc>
+        <w:tc>
+          <w:tcPr/>
+          <w:p>
+            <w:pPr>
+              <w:pStyle w:val="Compact"/>
+              <w:jc w:val="center"/>
+            </w:pPr>
+            <w:r>
+              <w:rPr>
+                <w:b/>
+                <w:bCs/>
+              </w:rPr>
+              <w:t xml:space="preserve">No</w:t>
+            </w:r>
+          </w:p>
+        </w:tc>
+        <w:tc>
+          <w:tcPr/>
+          <w:p>
+            <w:pPr>
+              <w:pStyle w:val="Compact"/>
+            </w:pPr>
+            <w:r>
+              <w:t xml:space="preserve">El cruce sirve para derivar iniciativas de acción, y esta entrega es diagnóstico: el enunciado pide no proponer solución todavía</w:t>
+            </w:r>
+          </w:p>
+        </w:tc>
+      </w:tr>
+      <w:tr>
+        <w:tc>
+          <w:tcPr/>
+          <w:p>
+            <w:pPr>
+              <w:pStyle w:val="Compact"/>
+            </w:pPr>
+            <w:r>
+              <w:rPr>
+                <w:b/>
+                <w:bCs/>
+              </w:rPr>
+              <w:t xml:space="preserve">Business Model Canvas To-Be</w:t>
+            </w:r>
+          </w:p>
+        </w:tc>
+        <w:tc>
+          <w:tcPr/>
+          <w:p>
+            <w:pPr>
+              <w:pStyle w:val="Compact"/>
+              <w:jc w:val="center"/>
+            </w:pPr>
+            <w:r>
+              <w:rPr>
+                <w:b/>
+                <w:bCs/>
+              </w:rPr>
+              <w:t xml:space="preserve">No</w:t>
+            </w:r>
+          </w:p>
+        </w:tc>
+        <w:tc>
+          <w:tcPr/>
+          <w:p>
+            <w:pPr>
+              <w:pStyle w:val="Compact"/>
+            </w:pPr>
+            <w:r>
+              <w:t xml:space="preserve">El enunciado pide el modelo de negocio actual, no el propuesto</w:t>
+            </w:r>
+          </w:p>
+        </w:tc>
+      </w:tr>
+      <w:tr>
+        <w:tc>
+          <w:tcPr/>
+          <w:p>
+            <w:pPr>
+              <w:pStyle w:val="Compact"/>
+            </w:pPr>
+            <w:r>
+              <w:rPr>
+                <w:b/>
+                <w:bCs/>
+              </w:rPr>
+              <w:t xml:space="preserve">Hipótesis de Oportunidad Tecnológica</w:t>
+            </w:r>
+          </w:p>
+        </w:tc>
+        <w:tc>
+          <w:tcPr/>
+          <w:p>
+            <w:pPr>
+              <w:pStyle w:val="Compact"/>
+              <w:jc w:val="center"/>
+            </w:pPr>
+            <w:r>
+              <w:rPr>
+                <w:b/>
+                <w:bCs/>
+              </w:rPr>
+              <w:t xml:space="preserve">No</w:t>
+            </w:r>
+          </w:p>
+        </w:tc>
+        <w:tc>
+          <w:tcPr/>
+          <w:p>
+            <w:pPr>
+              <w:pStyle w:val="Compact"/>
+            </w:pPr>
+            <w:r>
+              <w:t xml:space="preserve">Es una propuesta de solución. Corresponde al Hito 2</w:t>
+            </w:r>
+          </w:p>
+        </w:tc>
+      </w:tr>
+      <w:tr>
+        <w:tc>
+          <w:tcPr/>
+          <w:p>
+            <w:pPr>
+              <w:pStyle w:val="Compact"/>
+            </w:pPr>
+            <w:r>
+              <w:rPr>
+                <w:b/>
+                <w:bCs/>
+              </w:rPr>
+              <w:t xml:space="preserve">Design Thinking</w:t>
+            </w:r>
+          </w:p>
+        </w:tc>
+        <w:tc>
+          <w:tcPr/>
+          <w:p>
+            <w:pPr>
+              <w:pStyle w:val="Compact"/>
+              <w:jc w:val="center"/>
+            </w:pPr>
+            <w:r>
+              <w:rPr>
+                <w:b/>
+                <w:bCs/>
+              </w:rPr>
+              <w:t xml:space="preserve">No</w:t>
+            </w:r>
+          </w:p>
+        </w:tc>
+        <w:tc>
+          <w:tcPr/>
+          <w:p>
+            <w:pPr>
+              <w:pStyle w:val="Compact"/>
+            </w:pPr>
+            <w:r>
+              <w:t xml:space="preserve">Se vio en la Clase 3, pero sirve para idear soluciones, que todavía no toca</w:t>
+            </w:r>
+          </w:p>
+        </w:tc>
+      </w:tr>
+      <w:tr>
+        <w:tc>
+          <w:tcPr/>
+          <w:p>
+            <w:pPr>
+              <w:pStyle w:val="Compact"/>
+            </w:pPr>
+            <w:r>
+              <w:rPr>
+                <w:b/>
+                <w:bCs/>
+              </w:rPr>
+              <w:t xml:space="preserve">Balanced Scorecard y OKR</w:t>
+            </w:r>
+          </w:p>
+        </w:tc>
+        <w:tc>
+          <w:tcPr/>
+          <w:p>
+            <w:pPr>
+              <w:pStyle w:val="Compact"/>
+              <w:jc w:val="center"/>
+            </w:pPr>
+            <w:r>
+              <w:rPr>
+                <w:b/>
+                <w:bCs/>
+              </w:rPr>
+              <w:t xml:space="preserve">No</w:t>
+            </w:r>
+          </w:p>
+        </w:tc>
+        <w:tc>
+          <w:tcPr/>
+          <w:p>
+            <w:pPr>
+              <w:pStyle w:val="Compact"/>
+            </w:pPr>
+            <w:r>
+              <w:t xml:space="preserve">Corresponden al Hito 3: plan de ejecución y gobernanza</w:t>
+            </w:r>
+          </w:p>
+        </w:tc>
+      </w:tr>
+      <w:tr>
+        <w:tc>
+          <w:tcPr/>
+          <w:p>
+            <w:pPr>
+              <w:pStyle w:val="Compact"/>
+            </w:pPr>
+            <w:r>
+              <w:rPr>
+                <w:b/>
+                <w:bCs/>
+              </w:rPr>
+              <w:t xml:space="preserve">Plantilla del problema gerencial</w:t>
+            </w:r>
+          </w:p>
+        </w:tc>
+        <w:tc>
+          <w:tcPr/>
+          <w:p>
+            <w:pPr>
+              <w:pStyle w:val="Compact"/>
+              <w:jc w:val="center"/>
+            </w:pPr>
+            <w:r>
+              <w:rPr>
+                <w:b/>
+                <w:bCs/>
+              </w:rPr>
+              <w:t xml:space="preserve">No</w:t>
+            </w:r>
+          </w:p>
+        </w:tc>
+        <w:tc>
+          <w:tcPr/>
+          <w:p>
+            <w:pPr>
+              <w:pStyle w:val="Compact"/>
+            </w:pPr>
+            <w:r>
+              <w:t xml:space="preserve">Es para la sección 6, que se entrega por separado</w:t>
             </w:r>
           </w:p>
         </w:tc>
@@ -10166,368 +10278,7 @@
           <w:b/>
           <w:bCs/>
         </w:rPr>
-        <w:t xml:space="preserve">Cómo se encadenan</w:t>
-      </w:r>
-    </w:p>
-    <w:p>
-      <w:pPr>
-        <w:pStyle w:val="BodyText"/>
-      </w:pPr>
-      <w:r>
-        <w:t xml:space="preserve">El orden en que las aplicamos no es casual. Cada herramienta produce algo que la siguiente necesita.</w:t>
-      </w:r>
-    </w:p>
-    <w:p>
-      <w:pPr>
-        <w:pStyle w:val="SourceCode"/>
-      </w:pPr>
-      <w:r>
-        <w:rPr>
-          <w:rStyle w:val="VerbatimChar"/>
-        </w:rPr>
-        <w:t xml:space="preserve">SECCIÓN 1</w:t>
-      </w:r>
-      <w:r>
-        <w:br/>
-      </w:r>
-      <w:r>
-        <w:rPr>
-          <w:rStyle w:val="VerbatimChar"/>
-        </w:rPr>
-        <w:t xml:space="preserve">  Relevamiento de la organización</w:t>
-      </w:r>
-      <w:r>
-        <w:br/>
-      </w:r>
-      <w:r>
-        <w:rPr>
-          <w:rStyle w:val="VerbatimChar"/>
-        </w:rPr>
-        <w:t xml:space="preserve">       |</w:t>
-      </w:r>
-      <w:r>
-        <w:br/>
-      </w:r>
-      <w:r>
-        <w:rPr>
-          <w:rStyle w:val="VerbatimChar"/>
-        </w:rPr>
-        <w:t xml:space="preserve">       v</w:t>
-      </w:r>
-      <w:r>
-        <w:br/>
-      </w:r>
-      <w:r>
-        <w:rPr>
-          <w:rStyle w:val="VerbatimChar"/>
-        </w:rPr>
-        <w:t xml:space="preserve">SECCIÓN 2</w:t>
-      </w:r>
-      <w:r>
-        <w:br/>
-      </w:r>
-      <w:r>
-        <w:rPr>
-          <w:rStyle w:val="VerbatimChar"/>
-        </w:rPr>
-        <w:t xml:space="preserve">  Factores del entorno ----+</w:t>
-      </w:r>
-      <w:r>
-        <w:br/>
-      </w:r>
-      <w:r>
-        <w:rPr>
-          <w:rStyle w:val="VerbatimChar"/>
-        </w:rPr>
-        <w:t xml:space="preserve">                           |--&gt; Oportunidades y Amenazas --+</w:t>
-      </w:r>
-      <w:r>
-        <w:br/>
-      </w:r>
-      <w:r>
-        <w:rPr>
-          <w:rStyle w:val="VerbatimChar"/>
-        </w:rPr>
-        <w:t xml:space="preserve">  Cinco fuerzas -----------+                               |</w:t>
-      </w:r>
-      <w:r>
-        <w:br/>
-      </w:r>
-      <w:r>
-        <w:rPr>
-          <w:rStyle w:val="VerbatimChar"/>
-        </w:rPr>
-        <w:t xml:space="preserve">                                                           +--&gt; FODA</w:t>
-      </w:r>
-      <w:r>
-        <w:br/>
-      </w:r>
-      <w:r>
-        <w:rPr>
-          <w:rStyle w:val="VerbatimChar"/>
-        </w:rPr>
-        <w:t xml:space="preserve">  Cadena de valor ----&gt; Fortalezas y Debilidades ----------+</w:t>
-      </w:r>
-      <w:r>
-        <w:br/>
-      </w:r>
-      <w:r>
-        <w:rPr>
-          <w:rStyle w:val="VerbatimChar"/>
-        </w:rPr>
-        <w:t xml:space="preserve">       |</w:t>
-      </w:r>
-      <w:r>
-        <w:br/>
-      </w:r>
-      <w:r>
-        <w:rPr>
-          <w:rStyle w:val="VerbatimChar"/>
-        </w:rPr>
-        <w:t xml:space="preserve">       v</w:t>
-      </w:r>
-      <w:r>
-        <w:br/>
-      </w:r>
-      <w:r>
-        <w:rPr>
-          <w:rStyle w:val="VerbatimChar"/>
-        </w:rPr>
-        <w:t xml:space="preserve">SECCIÓN 3                          SECCIÓN 4                    SECCIÓN 5</w:t>
-      </w:r>
-      <w:r>
-        <w:br/>
-      </w:r>
-      <w:r>
-        <w:rPr>
-          <w:rStyle w:val="VerbatimChar"/>
-        </w:rPr>
-        <w:t xml:space="preserve">  Business Model Canvas              Value Proposition Canvas      Modelo de madurez</w:t>
-      </w:r>
-      <w:r>
-        <w:br/>
-      </w:r>
-      <w:r>
-        <w:rPr>
-          <w:rStyle w:val="VerbatimChar"/>
-        </w:rPr>
-        <w:t xml:space="preserve">  + Run / Change the Business        (segmento prioritario)        + Costo de No Actuar</w:t>
-      </w:r>
-      <w:r>
-        <w:br/>
-      </w:r>
-      <w:r>
-        <w:rPr>
-          <w:rStyle w:val="VerbatimChar"/>
-        </w:rPr>
-        <w:t xml:space="preserve">       |                                   |                             |</w:t>
-      </w:r>
-      <w:r>
-        <w:br/>
-      </w:r>
-      <w:r>
-        <w:rPr>
-          <w:rStyle w:val="VerbatimChar"/>
-        </w:rPr>
-        <w:t xml:space="preserve">       +-----------------------------------+-----------------------------+</w:t>
-      </w:r>
-      <w:r>
-        <w:br/>
-      </w:r>
-      <w:r>
-        <w:rPr>
-          <w:rStyle w:val="VerbatimChar"/>
-        </w:rPr>
-        <w:t xml:space="preserve">                                           |</w:t>
-      </w:r>
-      <w:r>
-        <w:br/>
-      </w:r>
-      <w:r>
-        <w:rPr>
-          <w:rStyle w:val="VerbatimChar"/>
-        </w:rPr>
-        <w:t xml:space="preserve">                                           v</w:t>
-      </w:r>
-      <w:r>
-        <w:br/>
-      </w:r>
-      <w:r>
-        <w:rPr>
-          <w:rStyle w:val="VerbatimChar"/>
-        </w:rPr>
-        <w:t xml:space="preserve">                                    SECCIÓN 6 (se entrega aparte)</w:t>
-      </w:r>
-      <w:r>
-        <w:br/>
-      </w:r>
-      <w:r>
-        <w:rPr>
-          <w:rStyle w:val="VerbatimChar"/>
-        </w:rPr>
-        <w:t xml:space="preserve">                                    Problema gerencial priorizado</w:t>
-      </w:r>
-    </w:p>
-    <w:p>
-      <w:pPr>
-        <w:pStyle w:val="FirstParagraph"/>
-      </w:pPr>
-      <w:r>
-        <w:t xml:space="preserve">En concreto:</w:t>
-      </w:r>
-    </w:p>
-    <w:p>
-      <w:pPr>
-        <w:pStyle w:val="Compact"/>
-        <w:numPr>
-          <w:ilvl w:val="0"/>
-          <w:numId w:val="1019"/>
-        </w:numPr>
-      </w:pPr>
-      <w:r>
-        <w:t xml:space="preserve">Los</w:t>
-      </w:r>
-      <w:r>
-        <w:t xml:space="preserve"> </w:t>
-      </w:r>
-      <w:r>
-        <w:rPr>
-          <w:b/>
-          <w:bCs/>
-        </w:rPr>
-        <w:t xml:space="preserve">factores del entorno</w:t>
-      </w:r>
-      <w:r>
-        <w:t xml:space="preserve"> </w:t>
-      </w:r>
-      <w:r>
-        <w:t xml:space="preserve">y las</w:t>
-      </w:r>
-      <w:r>
-        <w:t xml:space="preserve"> </w:t>
-      </w:r>
-      <w:r>
-        <w:rPr>
-          <w:b/>
-          <w:bCs/>
-        </w:rPr>
-        <w:t xml:space="preserve">cinco fuerzas</w:t>
-      </w:r>
-      <w:r>
-        <w:t xml:space="preserve"> </w:t>
-      </w:r>
-      <w:r>
-        <w:t xml:space="preserve">producen las oportunidades y las amenazas del FODA.</w:t>
-      </w:r>
-    </w:p>
-    <w:p>
-      <w:pPr>
-        <w:pStyle w:val="Compact"/>
-        <w:numPr>
-          <w:ilvl w:val="0"/>
-          <w:numId w:val="1019"/>
-        </w:numPr>
-      </w:pPr>
-      <w:r>
-        <w:t xml:space="preserve">La</w:t>
-      </w:r>
-      <w:r>
-        <w:t xml:space="preserve"> </w:t>
-      </w:r>
-      <w:r>
-        <w:rPr>
-          <w:b/>
-          <w:bCs/>
-        </w:rPr>
-        <w:t xml:space="preserve">cadena de valor</w:t>
-      </w:r>
-      <w:r>
-        <w:t xml:space="preserve"> </w:t>
-      </w:r>
-      <w:r>
-        <w:t xml:space="preserve">produce las fortalezas y las debilidades.</w:t>
-      </w:r>
-    </w:p>
-    <w:p>
-      <w:pPr>
-        <w:pStyle w:val="Compact"/>
-        <w:numPr>
-          <w:ilvl w:val="0"/>
-          <w:numId w:val="1019"/>
-        </w:numPr>
-      </w:pPr>
-      <w:r>
-        <w:t xml:space="preserve">El</w:t>
-      </w:r>
-      <w:r>
-        <w:t xml:space="preserve"> </w:t>
-      </w:r>
-      <w:r>
-        <w:rPr>
-          <w:b/>
-          <w:bCs/>
-        </w:rPr>
-        <w:t xml:space="preserve">segmento prioritario</w:t>
-      </w:r>
-      <w:r>
-        <w:t xml:space="preserve"> </w:t>
-      </w:r>
-      <w:r>
-        <w:t xml:space="preserve">de la sección 4 se justifica con lo que vimos en las cinco fuerzas.</w:t>
-      </w:r>
-    </w:p>
-    <w:p>
-      <w:pPr>
-        <w:pStyle w:val="Compact"/>
-        <w:numPr>
-          <w:ilvl w:val="0"/>
-          <w:numId w:val="1019"/>
-        </w:numPr>
-      </w:pPr>
-      <w:r>
-        <w:t xml:space="preserve">La</w:t>
-      </w:r>
-      <w:r>
-        <w:t xml:space="preserve"> </w:t>
-      </w:r>
-      <w:r>
-        <w:rPr>
-          <w:b/>
-          <w:bCs/>
-        </w:rPr>
-        <w:t xml:space="preserve">madurez</w:t>
-      </w:r>
-      <w:r>
-        <w:t xml:space="preserve"> </w:t>
-      </w:r>
-      <w:r>
-        <w:t xml:space="preserve">de la sección 5 se apoya en evidencia que fue apareciendo en las secciones 1 a 4.</w:t>
-      </w:r>
-    </w:p>
-    <w:bookmarkStart w:id="66" w:name="Xa178430d01598d7b142723fb7d24c42d8733294"/>
-    <w:p>
-      <w:pPr>
-        <w:pStyle w:val="Heading3"/>
-      </w:pPr>
-      <w:r>
-        <w:t xml:space="preserve">Herramientas que decidimos no usar, y por qué</w:t>
-      </w:r>
-    </w:p>
-    <w:p>
-      <w:pPr>
-        <w:pStyle w:val="FirstParagraph"/>
-      </w:pPr>
-      <w:r>
-        <w:t xml:space="preserve">El enunciado dice</w:t>
-      </w:r>
-      <w:r>
-        <w:t xml:space="preserve"> </w:t>
-      </w:r>
-      <w:r>
-        <w:t xml:space="preserve">“usar FODA, PESTEL, cinco fuerzas u otra herramienta equivalente”</w:t>
-      </w:r>
-      <w:r>
-        <w:t xml:space="preserve">, o sea que deja elegir. Estas quedaron afuera a propósito.</w:t>
+        <w:t xml:space="preserve">Dónde se usó cada una</w:t>
       </w:r>
     </w:p>
     <w:tbl>
@@ -10552,214 +10303,525 @@
               <w:pStyle w:val="Compact"/>
             </w:pPr>
             <w:r>
-              <w:t xml:space="preserve">Herramienta</w:t>
-            </w:r>
-          </w:p>
-        </w:tc>
-        <w:tc>
-          <w:tcPr/>
-          <w:p>
-            <w:pPr>
-              <w:pStyle w:val="Compact"/>
-            </w:pPr>
-            <w:r>
-              <w:t xml:space="preserve">Por qué la dejamos afuera</w:t>
-            </w:r>
-          </w:p>
-        </w:tc>
-      </w:tr>
-      <w:tr>
-        <w:tc>
-          <w:tcPr/>
-          <w:p>
-            <w:pPr>
-              <w:pStyle w:val="Compact"/>
-            </w:pPr>
-            <w:r>
-              <w:rPr>
-                <w:b/>
-                <w:bCs/>
-              </w:rPr>
-              <w:t xml:space="preserve">PESTEL completo</w:t>
-            </w:r>
-          </w:p>
-        </w:tc>
-        <w:tc>
-          <w:tcPr/>
-          <w:p>
-            <w:pPr>
-              <w:pStyle w:val="Compact"/>
-            </w:pPr>
-            <w:r>
-              <w:t xml:space="preserve">Lo probamos y cuatro de sus seis dimensiones volvían vacías en este caso: ninguna regulación los complicó, la presión ecológica no se siente, lo legal se pisa con lo político y lo tecnológico ya lo mide la sección 5 con más rigor. Llenar seis casilleros para que cuatro digan</w:t>
-            </w:r>
-            <w:r>
-              <w:t xml:space="preserve"> </w:t>
-            </w:r>
-            <w:r>
-              <w:t xml:space="preserve">“sin impacto”</w:t>
-            </w:r>
-            <w:r>
-              <w:t xml:space="preserve"> </w:t>
-            </w:r>
-            <w:r>
-              <w:t xml:space="preserve">es justo lo que advierte la guía de la cátedra cuando pregunta cuál es la diferencia entre listar un factor PESTEL y explicar su impacto real. Nos quedamos con los factores que sí impactan</w:t>
-            </w:r>
-          </w:p>
-        </w:tc>
-      </w:tr>
-      <w:tr>
-        <w:tc>
-          <w:tcPr/>
-          <w:p>
-            <w:pPr>
-              <w:pStyle w:val="Compact"/>
-            </w:pPr>
-            <w:r>
-              <w:rPr>
-                <w:b/>
-                <w:bCs/>
-              </w:rPr>
-              <w:t xml:space="preserve">FODA cruzado</w:t>
-            </w:r>
-          </w:p>
-        </w:tc>
-        <w:tc>
-          <w:tcPr/>
-          <w:p>
-            <w:pPr>
-              <w:pStyle w:val="Compact"/>
-            </w:pPr>
-            <w:r>
-              <w:t xml:space="preserve">El cruce existe para derivar iniciativas, y esta entrega es diagnóstico: el enunciado pide explícitamente no proponer solución todavía. El FODA simple sí lo hicimos, que además es la forma que usa la guía de la cátedra en su ejemplo resuelto</w:t>
-            </w:r>
-          </w:p>
-        </w:tc>
-      </w:tr>
-      <w:tr>
-        <w:tc>
-          <w:tcPr/>
-          <w:p>
-            <w:pPr>
-              <w:pStyle w:val="Compact"/>
-            </w:pPr>
-            <w:r>
-              <w:t xml:space="preserve">Hipótesis de Oportunidad Tecnológica</w:t>
-            </w:r>
-          </w:p>
-        </w:tc>
-        <w:tc>
-          <w:tcPr/>
-          <w:p>
-            <w:pPr>
-              <w:pStyle w:val="Compact"/>
-            </w:pPr>
-            <w:r>
-              <w:t xml:space="preserve">Es una propuesta de solución (To-Be) y este trabajo es diagnóstico del estado actual (AS-IS)</w:t>
-            </w:r>
-          </w:p>
-        </w:tc>
-      </w:tr>
-      <w:tr>
-        <w:tc>
-          <w:tcPr/>
-          <w:p>
-            <w:pPr>
-              <w:pStyle w:val="Compact"/>
-            </w:pPr>
-            <w:r>
-              <w:t xml:space="preserve">Business Model Canvas en versión To-Be</w:t>
-            </w:r>
-          </w:p>
-        </w:tc>
-        <w:tc>
-          <w:tcPr/>
-          <w:p>
-            <w:pPr>
-              <w:pStyle w:val="Compact"/>
-            </w:pPr>
-            <w:r>
-              <w:t xml:space="preserve">Mismo motivo: el enunciado pide el modelo actual, no el propuesto</w:t>
-            </w:r>
-          </w:p>
-        </w:tc>
-      </w:tr>
-      <w:tr>
-        <w:tc>
-          <w:tcPr/>
-          <w:p>
-            <w:pPr>
-              <w:pStyle w:val="Compact"/>
-            </w:pPr>
-            <w:r>
-              <w:t xml:space="preserve">Balanced Scorecard y OKR</w:t>
-            </w:r>
-          </w:p>
-        </w:tc>
-        <w:tc>
-          <w:tcPr/>
-          <w:p>
-            <w:pPr>
-              <w:pStyle w:val="Compact"/>
-            </w:pPr>
-            <w:r>
-              <w:t xml:space="preserve">Corresponden al Hito 3, no a esta entrega</w:t>
-            </w:r>
-          </w:p>
-        </w:tc>
-      </w:tr>
-      <w:tr>
-        <w:tc>
-          <w:tcPr/>
-          <w:p>
-            <w:pPr>
-              <w:pStyle w:val="Compact"/>
-            </w:pPr>
-            <w:r>
-              <w:t xml:space="preserve">Design Thinking</w:t>
-            </w:r>
-          </w:p>
-        </w:tc>
-        <w:tc>
-          <w:tcPr/>
-          <w:p>
-            <w:pPr>
-              <w:pStyle w:val="Compact"/>
-            </w:pPr>
-            <w:r>
-              <w:t xml:space="preserve">Se vio en la Clase 3 pero apunta a idear soluciones, que todavía no toca</w:t>
-            </w:r>
-          </w:p>
-        </w:tc>
-      </w:tr>
-      <w:tr>
-        <w:tc>
-          <w:tcPr/>
-          <w:p>
-            <w:pPr>
-              <w:pStyle w:val="Compact"/>
-            </w:pPr>
-            <w:r>
-              <w:t xml:space="preserve">Plantilla canónica del problema gerencial</w:t>
-            </w:r>
-          </w:p>
-        </w:tc>
-        <w:tc>
-          <w:tcPr/>
-          <w:p>
-            <w:pPr>
-              <w:pStyle w:val="Compact"/>
-            </w:pPr>
-            <w:r>
-              <w:t xml:space="preserve">Es para la sección 6, que entregamos aparte</w:t>
+              <w:t xml:space="preserve">Sección</w:t>
+            </w:r>
+          </w:p>
+        </w:tc>
+        <w:tc>
+          <w:tcPr/>
+          <w:p>
+            <w:pPr>
+              <w:pStyle w:val="Compact"/>
+            </w:pPr>
+            <w:r>
+              <w:t xml:space="preserve">Herramientas</w:t>
+            </w:r>
+          </w:p>
+        </w:tc>
+      </w:tr>
+      <w:tr>
+        <w:tc>
+          <w:tcPr/>
+          <w:p>
+            <w:pPr>
+              <w:pStyle w:val="Compact"/>
+            </w:pPr>
+            <w:r>
+              <w:t xml:space="preserve">1. La organización</w:t>
+            </w:r>
+          </w:p>
+        </w:tc>
+        <w:tc>
+          <w:tcPr/>
+          <w:p>
+            <w:pPr>
+              <w:pStyle w:val="Compact"/>
+            </w:pPr>
+            <w:r>
+              <w:t xml:space="preserve">Ninguna: es relevamiento descriptivo, con la estructura que pide el enunciado</w:t>
+            </w:r>
+          </w:p>
+        </w:tc>
+      </w:tr>
+      <w:tr>
+        <w:tc>
+          <w:tcPr/>
+          <w:p>
+            <w:pPr>
+              <w:pStyle w:val="Compact"/>
+            </w:pPr>
+            <w:r>
+              <w:t xml:space="preserve">2. El contexto</w:t>
+            </w:r>
+          </w:p>
+        </w:tc>
+        <w:tc>
+          <w:tcPr/>
+          <w:p>
+            <w:pPr>
+              <w:pStyle w:val="Compact"/>
+            </w:pPr>
+            <w:r>
+              <w:t xml:space="preserve">Factores del entorno · Cinco fuerzas · Cadena de valor · FODA</w:t>
+            </w:r>
+          </w:p>
+        </w:tc>
+      </w:tr>
+      <w:tr>
+        <w:tc>
+          <w:tcPr/>
+          <w:p>
+            <w:pPr>
+              <w:pStyle w:val="Compact"/>
+            </w:pPr>
+            <w:r>
+              <w:t xml:space="preserve">3. Modelo de negocio</w:t>
+            </w:r>
+          </w:p>
+        </w:tc>
+        <w:tc>
+          <w:tcPr/>
+          <w:p>
+            <w:pPr>
+              <w:pStyle w:val="Compact"/>
+            </w:pPr>
+            <w:r>
+              <w:t xml:space="preserve">Business Model Canvas · Run / Change the Business · Liderazgo en costos</w:t>
+            </w:r>
+          </w:p>
+        </w:tc>
+      </w:tr>
+      <w:tr>
+        <w:tc>
+          <w:tcPr/>
+          <w:p>
+            <w:pPr>
+              <w:pStyle w:val="Compact"/>
+            </w:pPr>
+            <w:r>
+              <w:t xml:space="preserve">4. Propuesta de valor</w:t>
+            </w:r>
+          </w:p>
+        </w:tc>
+        <w:tc>
+          <w:tcPr/>
+          <w:p>
+            <w:pPr>
+              <w:pStyle w:val="Compact"/>
+            </w:pPr>
+            <w:r>
+              <w:t xml:space="preserve">Value Proposition Canvas</w:t>
+            </w:r>
+          </w:p>
+        </w:tc>
+      </w:tr>
+      <w:tr>
+        <w:tc>
+          <w:tcPr/>
+          <w:p>
+            <w:pPr>
+              <w:pStyle w:val="Compact"/>
+            </w:pPr>
+            <w:r>
+              <w:t xml:space="preserve">5. Madurez</w:t>
+            </w:r>
+          </w:p>
+        </w:tc>
+        <w:tc>
+          <w:tcPr/>
+          <w:p>
+            <w:pPr>
+              <w:pStyle w:val="Compact"/>
+            </w:pPr>
+            <w:r>
+              <w:t xml:space="preserve">Modelo de madurez de la cátedra · Costo de No Actuar</w:t>
             </w:r>
           </w:p>
         </w:tc>
       </w:tr>
     </w:tbl>
+    <w:p>
+      <w:pPr>
+        <w:pStyle w:val="BodyText"/>
+      </w:pPr>
+      <w:r>
+        <w:rPr>
+          <w:b/>
+          <w:bCs/>
+        </w:rPr>
+        <w:t xml:space="preserve">Cómo se encadenan</w:t>
+      </w:r>
+    </w:p>
+    <w:p>
+      <w:pPr>
+        <w:pStyle w:val="BodyText"/>
+      </w:pPr>
+      <w:r>
+        <w:t xml:space="preserve">El orden en que las aplicamos no es casual. Cada herramienta produce algo que la siguiente necesita.</w:t>
+      </w:r>
+    </w:p>
+    <w:p>
+      <w:pPr>
+        <w:pStyle w:val="SourceCode"/>
+      </w:pPr>
+      <w:r>
+        <w:rPr>
+          <w:rStyle w:val="VerbatimChar"/>
+        </w:rPr>
+        <w:t xml:space="preserve">SECCIÓN 1</w:t>
+      </w:r>
+      <w:r>
+        <w:br/>
+      </w:r>
+      <w:r>
+        <w:rPr>
+          <w:rStyle w:val="VerbatimChar"/>
+        </w:rPr>
+        <w:t xml:space="preserve">  Relevamiento de la organización</w:t>
+      </w:r>
+      <w:r>
+        <w:br/>
+      </w:r>
+      <w:r>
+        <w:rPr>
+          <w:rStyle w:val="VerbatimChar"/>
+        </w:rPr>
+        <w:t xml:space="preserve">       |</w:t>
+      </w:r>
+      <w:r>
+        <w:br/>
+      </w:r>
+      <w:r>
+        <w:rPr>
+          <w:rStyle w:val="VerbatimChar"/>
+        </w:rPr>
+        <w:t xml:space="preserve">       v</w:t>
+      </w:r>
+      <w:r>
+        <w:br/>
+      </w:r>
+      <w:r>
+        <w:rPr>
+          <w:rStyle w:val="VerbatimChar"/>
+        </w:rPr>
+        <w:t xml:space="preserve">SECCIÓN 2</w:t>
+      </w:r>
+      <w:r>
+        <w:br/>
+      </w:r>
+      <w:r>
+        <w:rPr>
+          <w:rStyle w:val="VerbatimChar"/>
+        </w:rPr>
+        <w:t xml:space="preserve">  Factores del entorno ----+</w:t>
+      </w:r>
+      <w:r>
+        <w:br/>
+      </w:r>
+      <w:r>
+        <w:rPr>
+          <w:rStyle w:val="VerbatimChar"/>
+        </w:rPr>
+        <w:t xml:space="preserve">                           |--&gt; Oportunidades y Amenazas --+</w:t>
+      </w:r>
+      <w:r>
+        <w:br/>
+      </w:r>
+      <w:r>
+        <w:rPr>
+          <w:rStyle w:val="VerbatimChar"/>
+        </w:rPr>
+        <w:t xml:space="preserve">  Cinco fuerzas -----------+                               |</w:t>
+      </w:r>
+      <w:r>
+        <w:br/>
+      </w:r>
+      <w:r>
+        <w:rPr>
+          <w:rStyle w:val="VerbatimChar"/>
+        </w:rPr>
+        <w:t xml:space="preserve">                                                           +--&gt; FODA</w:t>
+      </w:r>
+      <w:r>
+        <w:br/>
+      </w:r>
+      <w:r>
+        <w:rPr>
+          <w:rStyle w:val="VerbatimChar"/>
+        </w:rPr>
+        <w:t xml:space="preserve">  Cadena de valor ----&gt; Fortalezas y Debilidades ----------+</w:t>
+      </w:r>
+      <w:r>
+        <w:br/>
+      </w:r>
+      <w:r>
+        <w:rPr>
+          <w:rStyle w:val="VerbatimChar"/>
+        </w:rPr>
+        <w:t xml:space="preserve">       |</w:t>
+      </w:r>
+      <w:r>
+        <w:br/>
+      </w:r>
+      <w:r>
+        <w:rPr>
+          <w:rStyle w:val="VerbatimChar"/>
+        </w:rPr>
+        <w:t xml:space="preserve">       v</w:t>
+      </w:r>
+      <w:r>
+        <w:br/>
+      </w:r>
+      <w:r>
+        <w:rPr>
+          <w:rStyle w:val="VerbatimChar"/>
+        </w:rPr>
+        <w:t xml:space="preserve">SECCIÓN 3                          SECCIÓN 4                    SECCIÓN 5</w:t>
+      </w:r>
+      <w:r>
+        <w:br/>
+      </w:r>
+      <w:r>
+        <w:rPr>
+          <w:rStyle w:val="VerbatimChar"/>
+        </w:rPr>
+        <w:t xml:space="preserve">  Business Model Canvas              Value Proposition Canvas      Modelo de madurez</w:t>
+      </w:r>
+      <w:r>
+        <w:br/>
+      </w:r>
+      <w:r>
+        <w:rPr>
+          <w:rStyle w:val="VerbatimChar"/>
+        </w:rPr>
+        <w:t xml:space="preserve">  + Run / Change the Business        (segmento prioritario)        + Costo de No Actuar</w:t>
+      </w:r>
+      <w:r>
+        <w:br/>
+      </w:r>
+      <w:r>
+        <w:rPr>
+          <w:rStyle w:val="VerbatimChar"/>
+        </w:rPr>
+        <w:t xml:space="preserve">       |                                   |                             |</w:t>
+      </w:r>
+      <w:r>
+        <w:br/>
+      </w:r>
+      <w:r>
+        <w:rPr>
+          <w:rStyle w:val="VerbatimChar"/>
+        </w:rPr>
+        <w:t xml:space="preserve">       +-----------------------------------+-----------------------------+</w:t>
+      </w:r>
+      <w:r>
+        <w:br/>
+      </w:r>
+      <w:r>
+        <w:rPr>
+          <w:rStyle w:val="VerbatimChar"/>
+        </w:rPr>
+        <w:t xml:space="preserve">                                           |</w:t>
+      </w:r>
+      <w:r>
+        <w:br/>
+      </w:r>
+      <w:r>
+        <w:rPr>
+          <w:rStyle w:val="VerbatimChar"/>
+        </w:rPr>
+        <w:t xml:space="preserve">                                           v</w:t>
+      </w:r>
+      <w:r>
+        <w:br/>
+      </w:r>
+      <w:r>
+        <w:rPr>
+          <w:rStyle w:val="VerbatimChar"/>
+        </w:rPr>
+        <w:t xml:space="preserve">                                    SECCIÓN 6 (se entrega aparte)</w:t>
+      </w:r>
+      <w:r>
+        <w:br/>
+      </w:r>
+      <w:r>
+        <w:rPr>
+          <w:rStyle w:val="VerbatimChar"/>
+        </w:rPr>
+        <w:t xml:space="preserve">                                    Problema gerencial priorizado</w:t>
+      </w:r>
+    </w:p>
+    <w:p>
+      <w:pPr>
+        <w:pStyle w:val="FirstParagraph"/>
+      </w:pPr>
+      <w:r>
+        <w:t xml:space="preserve">En concreto:</w:t>
+      </w:r>
+    </w:p>
+    <w:p>
+      <w:pPr>
+        <w:pStyle w:val="Compact"/>
+        <w:numPr>
+          <w:ilvl w:val="0"/>
+          <w:numId w:val="1019"/>
+        </w:numPr>
+      </w:pPr>
+      <w:r>
+        <w:t xml:space="preserve">Los</w:t>
+      </w:r>
+      <w:r>
+        <w:t xml:space="preserve"> </w:t>
+      </w:r>
+      <w:r>
+        <w:rPr>
+          <w:b/>
+          <w:bCs/>
+        </w:rPr>
+        <w:t xml:space="preserve">factores del entorno</w:t>
+      </w:r>
+      <w:r>
+        <w:t xml:space="preserve"> </w:t>
+      </w:r>
+      <w:r>
+        <w:t xml:space="preserve">y las</w:t>
+      </w:r>
+      <w:r>
+        <w:t xml:space="preserve"> </w:t>
+      </w:r>
+      <w:r>
+        <w:rPr>
+          <w:b/>
+          <w:bCs/>
+        </w:rPr>
+        <w:t xml:space="preserve">cinco fuerzas</w:t>
+      </w:r>
+      <w:r>
+        <w:t xml:space="preserve"> </w:t>
+      </w:r>
+      <w:r>
+        <w:t xml:space="preserve">producen las oportunidades y las amenazas del FODA.</w:t>
+      </w:r>
+    </w:p>
+    <w:p>
+      <w:pPr>
+        <w:pStyle w:val="Compact"/>
+        <w:numPr>
+          <w:ilvl w:val="0"/>
+          <w:numId w:val="1019"/>
+        </w:numPr>
+      </w:pPr>
+      <w:r>
+        <w:t xml:space="preserve">La</w:t>
+      </w:r>
+      <w:r>
+        <w:t xml:space="preserve"> </w:t>
+      </w:r>
+      <w:r>
+        <w:rPr>
+          <w:b/>
+          <w:bCs/>
+        </w:rPr>
+        <w:t xml:space="preserve">cadena de valor</w:t>
+      </w:r>
+      <w:r>
+        <w:t xml:space="preserve"> </w:t>
+      </w:r>
+      <w:r>
+        <w:t xml:space="preserve">produce las fortalezas y las debilidades.</w:t>
+      </w:r>
+    </w:p>
+    <w:p>
+      <w:pPr>
+        <w:pStyle w:val="Compact"/>
+        <w:numPr>
+          <w:ilvl w:val="0"/>
+          <w:numId w:val="1019"/>
+        </w:numPr>
+      </w:pPr>
+      <w:r>
+        <w:t xml:space="preserve">El</w:t>
+      </w:r>
+      <w:r>
+        <w:t xml:space="preserve"> </w:t>
+      </w:r>
+      <w:r>
+        <w:rPr>
+          <w:b/>
+          <w:bCs/>
+        </w:rPr>
+        <w:t xml:space="preserve">segmento prioritario</w:t>
+      </w:r>
+      <w:r>
+        <w:t xml:space="preserve"> </w:t>
+      </w:r>
+      <w:r>
+        <w:t xml:space="preserve">de la sección 4 se justifica con lo que vimos en las cinco fuerzas.</w:t>
+      </w:r>
+    </w:p>
+    <w:p>
+      <w:pPr>
+        <w:pStyle w:val="Compact"/>
+        <w:numPr>
+          <w:ilvl w:val="0"/>
+          <w:numId w:val="1019"/>
+        </w:numPr>
+      </w:pPr>
+      <w:r>
+        <w:t xml:space="preserve">La</w:t>
+      </w:r>
+      <w:r>
+        <w:t xml:space="preserve"> </w:t>
+      </w:r>
+      <w:r>
+        <w:rPr>
+          <w:b/>
+          <w:bCs/>
+        </w:rPr>
+        <w:t xml:space="preserve">madurez</w:t>
+      </w:r>
+      <w:r>
+        <w:t xml:space="preserve"> </w:t>
+      </w:r>
+      <w:r>
+        <w:t xml:space="preserve">de la sección 5 se apoya en evidencia que fue apareciendo en las secciones 1 a 4.</w:t>
+      </w:r>
+    </w:p>
+    <w:p>
+      <w:pPr>
+        <w:pStyle w:val="FirstParagraph"/>
+      </w:pPr>
+      <w:r>
+        <w:rPr>
+          <w:b/>
+          <w:bCs/>
+        </w:rPr>
+        <w:t xml:space="preserve">Lo que respalda las dos exclusiones</w:t>
+      </w:r>
+    </w:p>
+    <w:p>
+      <w:pPr>
+        <w:pStyle w:val="BodyText"/>
+      </w:pPr>
+      <w:r>
+        <w:t xml:space="preserve">La guía de la cátedra para este trabajo, con el caso Distribuidora Montaña, resuelve la sección de contexto con</w:t>
+      </w:r>
+      <w:r>
+        <w:t xml:space="preserve"> </w:t>
+      </w:r>
+      <w:r>
+        <w:rPr>
+          <w:b/>
+          <w:bCs/>
+        </w:rPr>
+        <w:t xml:space="preserve">“FODA + factores clave”</w:t>
+      </w:r>
+      <w:r>
+        <w:t xml:space="preserve">: no arma una matriz PESTEL, y su FODA es un cuadro simple sin cruzar. Además, una de sus preguntas guía es qué diferencia hay entre listar un factor PESTEL y explicar su impacto real en la empresa.</w:t>
+      </w:r>
+    </w:p>
     <w:bookmarkEnd w:id="66"/>
     <w:bookmarkEnd w:id="67"/>
-    <w:bookmarkEnd w:id="68"/>
     <w:sectPr>
       <w:footnotePr>
         <w:numRestart w:val="eachSect"/>

</xml_diff>